<commit_message>
Enable continuous line numbering in marked manuscript and update STROBE checklist with exact page and line citations
</commit_message>
<xml_diff>
--- a/docs/Supplimentary File 1_STROBE_Checklist_Cross_Sectional.docx
+++ b/docs/Supplimentary File 1_STROBE_Checklist_Cross_Sectional.docx
@@ -40,6 +40,14 @@
         <w:jc w:val="center"/>
         <w:tblLayout w:type="fixed"/>
         <w:tblLook w:firstColumn="1" w:firstRow="1" w:lastColumn="0" w:lastRow="0" w:noHBand="0" w:noVBand="1" w:val="04A0"/>
+        <w:tblBorders>
+          <w:top w:val="single" w:sz="6" w:space="0" w:color="002060"/>
+          <w:bottom w:val="single" w:sz="6" w:space="0" w:color="002060"/>
+          <w:left w:val="none"/>
+          <w:right w:val="none"/>
+          <w:insideH w:val="single" w:sz="4" w:space="0" w:color="E0E0E0"/>
+          <w:insideV w:val="none"/>
+        </w:tblBorders>
       </w:tblPr>
       <w:tblGrid>
         <w:gridCol w:w="2340"/>
@@ -50,7 +58,7 @@
       <w:tr>
         <w:tc>
           <w:tcPr>
-            <w:tcW w:type="dxa" w:w="1152"/>
+            <w:tcW w:type="dxa" w:w="936"/>
             <w:tcMar>
               <w:top w:w="120" w:type="dxa"/>
               <w:bottom w:w="120" w:type="dxa"/>
@@ -63,17 +71,18 @@
               <w:left w:val="none"/>
               <w:right w:val="none"/>
             </w:tcBorders>
+            <w:shd w:fill="F2F4F8"/>
           </w:tcPr>
           <w:p>
             <w:pPr>
-              <w:spacing w:after="40" w:line="240" w:lineRule="auto"/>
+              <w:jc w:val="left"/>
             </w:pPr>
             <w:r>
               <w:rPr>
-                <w:rFonts w:ascii="Times New Roman" w:hAnsi="Times New Roman"/>
+                <w:rFonts w:ascii="Cambria" w:hAnsi="Cambria"/>
                 <w:b/>
-                <w:color w:val="000000"/>
-                <w:sz w:val="19"/>
+                <w:color w:val="002060"/>
+                <w:sz w:val="20"/>
               </w:rPr>
               <w:t>Item No.</w:t>
             </w:r>
@@ -81,7 +90,7 @@
         </w:tc>
         <w:tc>
           <w:tcPr>
-            <w:tcW w:type="dxa" w:w="2592"/>
+            <w:tcW w:type="dxa" w:w="2088"/>
             <w:tcMar>
               <w:top w:w="120" w:type="dxa"/>
               <w:bottom w:w="120" w:type="dxa"/>
@@ -94,17 +103,18 @@
               <w:left w:val="none"/>
               <w:right w:val="none"/>
             </w:tcBorders>
+            <w:shd w:fill="F2F4F8"/>
           </w:tcPr>
           <w:p>
             <w:pPr>
-              <w:spacing w:after="40" w:line="240" w:lineRule="auto"/>
+              <w:jc w:val="left"/>
             </w:pPr>
             <w:r>
               <w:rPr>
-                <w:rFonts w:ascii="Times New Roman" w:hAnsi="Times New Roman"/>
+                <w:rFonts w:ascii="Cambria" w:hAnsi="Cambria"/>
                 <w:b/>
-                <w:color w:val="000000"/>
-                <w:sz w:val="19"/>
+                <w:color w:val="002060"/>
+                <w:sz w:val="20"/>
               </w:rPr>
               <w:t>Recommendation Section</w:t>
             </w:r>
@@ -112,7 +122,7 @@
         </w:tc>
         <w:tc>
           <w:tcPr>
-            <w:tcW w:type="dxa" w:w="5184"/>
+            <w:tcW w:type="dxa" w:w="3384"/>
             <w:tcMar>
               <w:top w:w="120" w:type="dxa"/>
               <w:bottom w:w="120" w:type="dxa"/>
@@ -125,17 +135,18 @@
               <w:left w:val="none"/>
               <w:right w:val="none"/>
             </w:tcBorders>
+            <w:shd w:fill="F2F4F8"/>
           </w:tcPr>
           <w:p>
             <w:pPr>
-              <w:spacing w:after="40" w:line="240" w:lineRule="auto"/>
+              <w:jc w:val="left"/>
             </w:pPr>
             <w:r>
               <w:rPr>
-                <w:rFonts w:ascii="Times New Roman" w:hAnsi="Times New Roman"/>
+                <w:rFonts w:ascii="Cambria" w:hAnsi="Cambria"/>
                 <w:b/>
-                <w:color w:val="000000"/>
-                <w:sz w:val="19"/>
+                <w:color w:val="002060"/>
+                <w:sz w:val="20"/>
               </w:rPr>
               <w:t>STROBE Recommendation Details</w:t>
             </w:r>
@@ -143,7 +154,7 @@
         </w:tc>
         <w:tc>
           <w:tcPr>
-            <w:tcW w:type="dxa" w:w="2592"/>
+            <w:tcW w:type="dxa" w:w="3384"/>
             <w:tcMar>
               <w:top w:w="120" w:type="dxa"/>
               <w:bottom w:w="120" w:type="dxa"/>
@@ -156,19 +167,20 @@
               <w:left w:val="none"/>
               <w:right w:val="none"/>
             </w:tcBorders>
+            <w:shd w:fill="F2F4F8"/>
           </w:tcPr>
           <w:p>
             <w:pPr>
-              <w:spacing w:after="40" w:line="240" w:lineRule="auto"/>
+              <w:jc w:val="left"/>
             </w:pPr>
             <w:r>
               <w:rPr>
-                <w:rFonts w:ascii="Times New Roman" w:hAnsi="Times New Roman"/>
+                <w:rFonts w:ascii="Cambria" w:hAnsi="Cambria"/>
                 <w:b/>
-                <w:color w:val="000000"/>
-                <w:sz w:val="19"/>
+                <w:color w:val="002060"/>
+                <w:sz w:val="20"/>
               </w:rPr>
-              <w:t>Reported in Manuscript</w:t>
+              <w:t>Reported in Manuscript (Section, Page, Lines)</w:t>
             </w:r>
           </w:p>
         </w:tc>
@@ -176,7 +188,7 @@
       <w:tr>
         <w:tc>
           <w:tcPr>
-            <w:tcW w:type="dxa" w:w="1152"/>
+            <w:tcW w:type="dxa" w:w="936"/>
             <w:tcMar>
               <w:top w:w="80" w:type="dxa"/>
               <w:bottom w:w="80" w:type="dxa"/>
@@ -192,13 +204,12 @@
           </w:tcPr>
           <w:p>
             <w:pPr>
-              <w:spacing w:after="40" w:line="240" w:lineRule="auto"/>
+              <w:jc w:val="left"/>
             </w:pPr>
             <w:r>
               <w:rPr>
-                <w:rFonts w:ascii="Times New Roman" w:hAnsi="Times New Roman"/>
+                <w:rFonts w:ascii="Cambria" w:hAnsi="Cambria"/>
                 <w:b/>
-                <w:color w:val="000000"/>
                 <w:sz w:val="18"/>
               </w:rPr>
               <w:t>1</w:t>
@@ -207,7 +218,7 @@
         </w:tc>
         <w:tc>
           <w:tcPr>
-            <w:tcW w:type="dxa" w:w="2592"/>
+            <w:tcW w:type="dxa" w:w="2088"/>
             <w:tcMar>
               <w:top w:w="80" w:type="dxa"/>
               <w:bottom w:w="80" w:type="dxa"/>
@@ -223,13 +234,11 @@
           </w:tcPr>
           <w:p>
             <w:pPr>
-              <w:spacing w:after="40" w:line="240" w:lineRule="auto"/>
+              <w:jc w:val="left"/>
             </w:pPr>
             <w:r>
               <w:rPr>
-                <w:rFonts w:ascii="Times New Roman" w:hAnsi="Times New Roman"/>
-                <w:b/>
-                <w:color w:val="000000"/>
+                <w:rFonts w:ascii="Cambria" w:hAnsi="Cambria"/>
                 <w:sz w:val="18"/>
               </w:rPr>
               <w:t>Title and abstract</w:t>
@@ -238,7 +247,7 @@
         </w:tc>
         <w:tc>
           <w:tcPr>
-            <w:tcW w:type="dxa" w:w="5184"/>
+            <w:tcW w:type="dxa" w:w="3384"/>
             <w:tcMar>
               <w:top w:w="80" w:type="dxa"/>
               <w:bottom w:w="80" w:type="dxa"/>
@@ -254,12 +263,11 @@
           </w:tcPr>
           <w:p>
             <w:pPr>
-              <w:spacing w:after="40" w:line="240" w:lineRule="auto"/>
+              <w:jc w:val="left"/>
             </w:pPr>
             <w:r>
               <w:rPr>
-                <w:rFonts w:ascii="Times New Roman" w:hAnsi="Times New Roman"/>
-                <w:color w:val="000000"/>
+                <w:rFonts w:ascii="Cambria" w:hAnsi="Cambria"/>
                 <w:sz w:val="18"/>
               </w:rPr>
               <w:t>(a) Indicate the study's design with a commonly used term in the title or the abstract</w:t>
@@ -268,7 +276,7 @@
         </w:tc>
         <w:tc>
           <w:tcPr>
-            <w:tcW w:type="dxa" w:w="2592"/>
+            <w:tcW w:type="dxa" w:w="3384"/>
             <w:tcMar>
               <w:top w:w="80" w:type="dxa"/>
               <w:bottom w:w="80" w:type="dxa"/>
@@ -284,15 +292,15 @@
           </w:tcPr>
           <w:p>
             <w:pPr>
-              <w:spacing w:after="40" w:line="240" w:lineRule="auto"/>
+              <w:jc w:val="left"/>
             </w:pPr>
             <w:r>
               <w:rPr>
-                <w:rFonts w:ascii="Times New Roman" w:hAnsi="Times New Roman"/>
-                <w:color w:val="000000"/>
+                <w:rFonts w:ascii="Cambria" w:hAnsi="Cambria"/>
+                <w:b w:val="0"/>
                 <w:sz w:val="18"/>
               </w:rPr>
-              <w:t>Title, Page 1; Abstract, Page 1</w:t>
+              <w:t>Title, Page 1, Lines 1–3; Abstract (Methods), Page 1, Lines 12–15</w:t>
             </w:r>
           </w:p>
         </w:tc>
@@ -300,7 +308,7 @@
       <w:tr>
         <w:tc>
           <w:tcPr>
-            <w:tcW w:type="dxa" w:w="1152"/>
+            <w:tcW w:type="dxa" w:w="936"/>
             <w:tcMar>
               <w:top w:w="80" w:type="dxa"/>
               <w:bottom w:w="80" w:type="dxa"/>
@@ -316,12 +324,12 @@
           </w:tcPr>
           <w:p>
             <w:pPr>
-              <w:spacing w:after="40" w:line="240" w:lineRule="auto"/>
+              <w:jc w:val="left"/>
             </w:pPr>
             <w:r>
               <w:rPr>
-                <w:rFonts w:ascii="Times New Roman" w:hAnsi="Times New Roman"/>
-                <w:color w:val="000000"/>
+                <w:rFonts w:ascii="Cambria" w:hAnsi="Cambria"/>
+                <w:b/>
                 <w:sz w:val="18"/>
               </w:rPr>
             </w:r>
@@ -329,7 +337,7 @@
         </w:tc>
         <w:tc>
           <w:tcPr>
-            <w:tcW w:type="dxa" w:w="2592"/>
+            <w:tcW w:type="dxa" w:w="2088"/>
             <w:tcMar>
               <w:top w:w="80" w:type="dxa"/>
               <w:bottom w:w="80" w:type="dxa"/>
@@ -345,12 +353,11 @@
           </w:tcPr>
           <w:p>
             <w:pPr>
-              <w:spacing w:after="40" w:line="240" w:lineRule="auto"/>
+              <w:jc w:val="left"/>
             </w:pPr>
             <w:r>
               <w:rPr>
-                <w:rFonts w:ascii="Times New Roman" w:hAnsi="Times New Roman"/>
-                <w:color w:val="000000"/>
+                <w:rFonts w:ascii="Cambria" w:hAnsi="Cambria"/>
                 <w:sz w:val="18"/>
               </w:rPr>
             </w:r>
@@ -358,7 +365,7 @@
         </w:tc>
         <w:tc>
           <w:tcPr>
-            <w:tcW w:type="dxa" w:w="5184"/>
+            <w:tcW w:type="dxa" w:w="3384"/>
             <w:tcMar>
               <w:top w:w="80" w:type="dxa"/>
               <w:bottom w:w="80" w:type="dxa"/>
@@ -374,12 +381,11 @@
           </w:tcPr>
           <w:p>
             <w:pPr>
-              <w:spacing w:after="40" w:line="240" w:lineRule="auto"/>
+              <w:jc w:val="left"/>
             </w:pPr>
             <w:r>
               <w:rPr>
-                <w:rFonts w:ascii="Times New Roman" w:hAnsi="Times New Roman"/>
-                <w:color w:val="000000"/>
+                <w:rFonts w:ascii="Cambria" w:hAnsi="Cambria"/>
                 <w:sz w:val="18"/>
               </w:rPr>
               <w:t>(b) Provide in the abstract an informative and balanced summary of what was done and what was found</w:t>
@@ -388,7 +394,7 @@
         </w:tc>
         <w:tc>
           <w:tcPr>
-            <w:tcW w:type="dxa" w:w="2592"/>
+            <w:tcW w:type="dxa" w:w="3384"/>
             <w:tcMar>
               <w:top w:w="80" w:type="dxa"/>
               <w:bottom w:w="80" w:type="dxa"/>
@@ -404,15 +410,15 @@
           </w:tcPr>
           <w:p>
             <w:pPr>
-              <w:spacing w:after="40" w:line="240" w:lineRule="auto"/>
+              <w:jc w:val="left"/>
             </w:pPr>
             <w:r>
               <w:rPr>
-                <w:rFonts w:ascii="Times New Roman" w:hAnsi="Times New Roman"/>
-                <w:color w:val="000000"/>
+                <w:rFonts w:ascii="Cambria" w:hAnsi="Cambria"/>
+                <w:b w:val="0"/>
                 <w:sz w:val="18"/>
               </w:rPr>
-              <w:t>Abstract, Page 1</w:t>
+              <w:t>Abstract, Page 1, Lines 7–36</w:t>
             </w:r>
           </w:p>
         </w:tc>
@@ -420,7 +426,7 @@
       <w:tr>
         <w:tc>
           <w:tcPr>
-            <w:tcW w:type="dxa" w:w="1152"/>
+            <w:tcW w:type="dxa" w:w="936"/>
             <w:tcMar>
               <w:top w:w="80" w:type="dxa"/>
               <w:bottom w:w="80" w:type="dxa"/>
@@ -436,13 +442,12 @@
           </w:tcPr>
           <w:p>
             <w:pPr>
-              <w:spacing w:after="40" w:line="240" w:lineRule="auto"/>
+              <w:jc w:val="left"/>
             </w:pPr>
             <w:r>
               <w:rPr>
-                <w:rFonts w:ascii="Times New Roman" w:hAnsi="Times New Roman"/>
+                <w:rFonts w:ascii="Cambria" w:hAnsi="Cambria"/>
                 <w:b/>
-                <w:color w:val="000000"/>
                 <w:sz w:val="18"/>
               </w:rPr>
               <w:t>2</w:t>
@@ -451,7 +456,7 @@
         </w:tc>
         <w:tc>
           <w:tcPr>
-            <w:tcW w:type="dxa" w:w="2592"/>
+            <w:tcW w:type="dxa" w:w="2088"/>
             <w:tcMar>
               <w:top w:w="80" w:type="dxa"/>
               <w:bottom w:w="80" w:type="dxa"/>
@@ -467,13 +472,11 @@
           </w:tcPr>
           <w:p>
             <w:pPr>
-              <w:spacing w:after="40" w:line="240" w:lineRule="auto"/>
+              <w:jc w:val="left"/>
             </w:pPr>
             <w:r>
               <w:rPr>
-                <w:rFonts w:ascii="Times New Roman" w:hAnsi="Times New Roman"/>
-                <w:b/>
-                <w:color w:val="000000"/>
+                <w:rFonts w:ascii="Cambria" w:hAnsi="Cambria"/>
                 <w:sz w:val="18"/>
               </w:rPr>
               <w:t>Background / rationale</w:t>
@@ -482,7 +485,7 @@
         </w:tc>
         <w:tc>
           <w:tcPr>
-            <w:tcW w:type="dxa" w:w="5184"/>
+            <w:tcW w:type="dxa" w:w="3384"/>
             <w:tcMar>
               <w:top w:w="80" w:type="dxa"/>
               <w:bottom w:w="80" w:type="dxa"/>
@@ -498,12 +501,11 @@
           </w:tcPr>
           <w:p>
             <w:pPr>
-              <w:spacing w:after="40" w:line="240" w:lineRule="auto"/>
+              <w:jc w:val="left"/>
             </w:pPr>
             <w:r>
               <w:rPr>
-                <w:rFonts w:ascii="Times New Roman" w:hAnsi="Times New Roman"/>
-                <w:color w:val="000000"/>
+                <w:rFonts w:ascii="Cambria" w:hAnsi="Cambria"/>
                 <w:sz w:val="18"/>
               </w:rPr>
               <w:t>Explain the scientific background and rationale for the investigation being reported</w:t>
@@ -512,7 +514,7 @@
         </w:tc>
         <w:tc>
           <w:tcPr>
-            <w:tcW w:type="dxa" w:w="2592"/>
+            <w:tcW w:type="dxa" w:w="3384"/>
             <w:tcMar>
               <w:top w:w="80" w:type="dxa"/>
               <w:bottom w:w="80" w:type="dxa"/>
@@ -528,15 +530,15 @@
           </w:tcPr>
           <w:p>
             <w:pPr>
-              <w:spacing w:after="40" w:line="240" w:lineRule="auto"/>
+              <w:jc w:val="left"/>
             </w:pPr>
             <w:r>
               <w:rPr>
-                <w:rFonts w:ascii="Times New Roman" w:hAnsi="Times New Roman"/>
-                <w:color w:val="000000"/>
+                <w:rFonts w:ascii="Cambria" w:hAnsi="Cambria"/>
+                <w:b w:val="0"/>
                 <w:sz w:val="18"/>
               </w:rPr>
-              <w:t>Section 1 (Introduction), Pages 2–3</w:t>
+              <w:t>Section 'Introduction', Pages 2–4, Lines 56–122</w:t>
             </w:r>
           </w:p>
         </w:tc>
@@ -544,7 +546,7 @@
       <w:tr>
         <w:tc>
           <w:tcPr>
-            <w:tcW w:type="dxa" w:w="1152"/>
+            <w:tcW w:type="dxa" w:w="936"/>
             <w:tcMar>
               <w:top w:w="80" w:type="dxa"/>
               <w:bottom w:w="80" w:type="dxa"/>
@@ -560,13 +562,12 @@
           </w:tcPr>
           <w:p>
             <w:pPr>
-              <w:spacing w:after="40" w:line="240" w:lineRule="auto"/>
+              <w:jc w:val="left"/>
             </w:pPr>
             <w:r>
               <w:rPr>
-                <w:rFonts w:ascii="Times New Roman" w:hAnsi="Times New Roman"/>
+                <w:rFonts w:ascii="Cambria" w:hAnsi="Cambria"/>
                 <w:b/>
-                <w:color w:val="000000"/>
                 <w:sz w:val="18"/>
               </w:rPr>
               <w:t>3</w:t>
@@ -575,7 +576,7 @@
         </w:tc>
         <w:tc>
           <w:tcPr>
-            <w:tcW w:type="dxa" w:w="2592"/>
+            <w:tcW w:type="dxa" w:w="2088"/>
             <w:tcMar>
               <w:top w:w="80" w:type="dxa"/>
               <w:bottom w:w="80" w:type="dxa"/>
@@ -591,13 +592,11 @@
           </w:tcPr>
           <w:p>
             <w:pPr>
-              <w:spacing w:after="40" w:line="240" w:lineRule="auto"/>
+              <w:jc w:val="left"/>
             </w:pPr>
             <w:r>
               <w:rPr>
-                <w:rFonts w:ascii="Times New Roman" w:hAnsi="Times New Roman"/>
-                <w:b/>
-                <w:color w:val="000000"/>
+                <w:rFonts w:ascii="Cambria" w:hAnsi="Cambria"/>
                 <w:sz w:val="18"/>
               </w:rPr>
               <w:t>Objectives</w:t>
@@ -606,7 +605,7 @@
         </w:tc>
         <w:tc>
           <w:tcPr>
-            <w:tcW w:type="dxa" w:w="5184"/>
+            <w:tcW w:type="dxa" w:w="3384"/>
             <w:tcMar>
               <w:top w:w="80" w:type="dxa"/>
               <w:bottom w:w="80" w:type="dxa"/>
@@ -622,12 +621,11 @@
           </w:tcPr>
           <w:p>
             <w:pPr>
-              <w:spacing w:after="40" w:line="240" w:lineRule="auto"/>
+              <w:jc w:val="left"/>
             </w:pPr>
             <w:r>
               <w:rPr>
-                <w:rFonts w:ascii="Times New Roman" w:hAnsi="Times New Roman"/>
-                <w:color w:val="000000"/>
+                <w:rFonts w:ascii="Cambria" w:hAnsi="Cambria"/>
                 <w:sz w:val="18"/>
               </w:rPr>
               <w:t>State specific objectives, including any prespecified hypotheses</w:t>
@@ -636,7 +634,7 @@
         </w:tc>
         <w:tc>
           <w:tcPr>
-            <w:tcW w:type="dxa" w:w="2592"/>
+            <w:tcW w:type="dxa" w:w="3384"/>
             <w:tcMar>
               <w:top w:w="80" w:type="dxa"/>
               <w:bottom w:w="80" w:type="dxa"/>
@@ -652,15 +650,15 @@
           </w:tcPr>
           <w:p>
             <w:pPr>
-              <w:spacing w:after="40" w:line="240" w:lineRule="auto"/>
+              <w:jc w:val="left"/>
             </w:pPr>
             <w:r>
               <w:rPr>
-                <w:rFonts w:ascii="Times New Roman" w:hAnsi="Times New Roman"/>
-                <w:color w:val="000000"/>
+                <w:rFonts w:ascii="Cambria" w:hAnsi="Cambria"/>
+                <w:b w:val="0"/>
                 <w:sz w:val="18"/>
               </w:rPr>
-              <w:t>Section 1 (Introduction), Page 4</w:t>
+              <w:t>Section 'Introduction', Pages 4–5, Lines 123–138</w:t>
             </w:r>
           </w:p>
         </w:tc>
@@ -668,7 +666,7 @@
       <w:tr>
         <w:tc>
           <w:tcPr>
-            <w:tcW w:type="dxa" w:w="1152"/>
+            <w:tcW w:type="dxa" w:w="936"/>
             <w:tcMar>
               <w:top w:w="80" w:type="dxa"/>
               <w:bottom w:w="80" w:type="dxa"/>
@@ -684,13 +682,12 @@
           </w:tcPr>
           <w:p>
             <w:pPr>
-              <w:spacing w:after="40" w:line="240" w:lineRule="auto"/>
+              <w:jc w:val="left"/>
             </w:pPr>
             <w:r>
               <w:rPr>
-                <w:rFonts w:ascii="Times New Roman" w:hAnsi="Times New Roman"/>
+                <w:rFonts w:ascii="Cambria" w:hAnsi="Cambria"/>
                 <w:b/>
-                <w:color w:val="000000"/>
                 <w:sz w:val="18"/>
               </w:rPr>
               <w:t>4</w:t>
@@ -699,7 +696,7 @@
         </w:tc>
         <w:tc>
           <w:tcPr>
-            <w:tcW w:type="dxa" w:w="2592"/>
+            <w:tcW w:type="dxa" w:w="2088"/>
             <w:tcMar>
               <w:top w:w="80" w:type="dxa"/>
               <w:bottom w:w="80" w:type="dxa"/>
@@ -715,13 +712,11 @@
           </w:tcPr>
           <w:p>
             <w:pPr>
-              <w:spacing w:after="40" w:line="240" w:lineRule="auto"/>
+              <w:jc w:val="left"/>
             </w:pPr>
             <w:r>
               <w:rPr>
-                <w:rFonts w:ascii="Times New Roman" w:hAnsi="Times New Roman"/>
-                <w:b/>
-                <w:color w:val="000000"/>
+                <w:rFonts w:ascii="Cambria" w:hAnsi="Cambria"/>
                 <w:sz w:val="18"/>
               </w:rPr>
               <w:t>Study design</w:t>
@@ -730,7 +725,7 @@
         </w:tc>
         <w:tc>
           <w:tcPr>
-            <w:tcW w:type="dxa" w:w="5184"/>
+            <w:tcW w:type="dxa" w:w="3384"/>
             <w:tcMar>
               <w:top w:w="80" w:type="dxa"/>
               <w:bottom w:w="80" w:type="dxa"/>
@@ -746,12 +741,11 @@
           </w:tcPr>
           <w:p>
             <w:pPr>
-              <w:spacing w:after="40" w:line="240" w:lineRule="auto"/>
+              <w:jc w:val="left"/>
             </w:pPr>
             <w:r>
               <w:rPr>
-                <w:rFonts w:ascii="Times New Roman" w:hAnsi="Times New Roman"/>
-                <w:color w:val="000000"/>
+                <w:rFonts w:ascii="Cambria" w:hAnsi="Cambria"/>
                 <w:sz w:val="18"/>
               </w:rPr>
               <w:t>Present key elements of study design early in the paper</w:t>
@@ -760,7 +754,7 @@
         </w:tc>
         <w:tc>
           <w:tcPr>
-            <w:tcW w:type="dxa" w:w="2592"/>
+            <w:tcW w:type="dxa" w:w="3384"/>
             <w:tcMar>
               <w:top w:w="80" w:type="dxa"/>
               <w:bottom w:w="80" w:type="dxa"/>
@@ -776,15 +770,15 @@
           </w:tcPr>
           <w:p>
             <w:pPr>
-              <w:spacing w:after="40" w:line="240" w:lineRule="auto"/>
+              <w:jc w:val="left"/>
             </w:pPr>
             <w:r>
               <w:rPr>
-                <w:rFonts w:ascii="Times New Roman" w:hAnsi="Times New Roman"/>
-                <w:color w:val="000000"/>
+                <w:rFonts w:ascii="Cambria" w:hAnsi="Cambria"/>
+                <w:b w:val="0"/>
                 <w:sz w:val="18"/>
               </w:rPr>
-              <w:t>Section 2.1, Page 4</w:t>
+              <w:t>Section 'Study Design, Sampling, and Analytical Sample', Page 5, Lines 140–164</w:t>
             </w:r>
           </w:p>
         </w:tc>
@@ -792,7 +786,7 @@
       <w:tr>
         <w:tc>
           <w:tcPr>
-            <w:tcW w:type="dxa" w:w="1152"/>
+            <w:tcW w:type="dxa" w:w="936"/>
             <w:tcMar>
               <w:top w:w="80" w:type="dxa"/>
               <w:bottom w:w="80" w:type="dxa"/>
@@ -808,13 +802,12 @@
           </w:tcPr>
           <w:p>
             <w:pPr>
-              <w:spacing w:after="40" w:line="240" w:lineRule="auto"/>
+              <w:jc w:val="left"/>
             </w:pPr>
             <w:r>
               <w:rPr>
-                <w:rFonts w:ascii="Times New Roman" w:hAnsi="Times New Roman"/>
+                <w:rFonts w:ascii="Cambria" w:hAnsi="Cambria"/>
                 <w:b/>
-                <w:color w:val="000000"/>
                 <w:sz w:val="18"/>
               </w:rPr>
               <w:t>5</w:t>
@@ -823,7 +816,7 @@
         </w:tc>
         <w:tc>
           <w:tcPr>
-            <w:tcW w:type="dxa" w:w="2592"/>
+            <w:tcW w:type="dxa" w:w="2088"/>
             <w:tcMar>
               <w:top w:w="80" w:type="dxa"/>
               <w:bottom w:w="80" w:type="dxa"/>
@@ -839,13 +832,11 @@
           </w:tcPr>
           <w:p>
             <w:pPr>
-              <w:spacing w:after="40" w:line="240" w:lineRule="auto"/>
+              <w:jc w:val="left"/>
             </w:pPr>
             <w:r>
               <w:rPr>
-                <w:rFonts w:ascii="Times New Roman" w:hAnsi="Times New Roman"/>
-                <w:b/>
-                <w:color w:val="000000"/>
+                <w:rFonts w:ascii="Cambria" w:hAnsi="Cambria"/>
                 <w:sz w:val="18"/>
               </w:rPr>
               <w:t>Setting</w:t>
@@ -854,7 +845,7 @@
         </w:tc>
         <w:tc>
           <w:tcPr>
-            <w:tcW w:type="dxa" w:w="5184"/>
+            <w:tcW w:type="dxa" w:w="3384"/>
             <w:tcMar>
               <w:top w:w="80" w:type="dxa"/>
               <w:bottom w:w="80" w:type="dxa"/>
@@ -870,12 +861,11 @@
           </w:tcPr>
           <w:p>
             <w:pPr>
-              <w:spacing w:after="40" w:line="240" w:lineRule="auto"/>
+              <w:jc w:val="left"/>
             </w:pPr>
             <w:r>
               <w:rPr>
-                <w:rFonts w:ascii="Times New Roman" w:hAnsi="Times New Roman"/>
-                <w:color w:val="000000"/>
+                <w:rFonts w:ascii="Cambria" w:hAnsi="Cambria"/>
                 <w:sz w:val="18"/>
               </w:rPr>
               <w:t>Describe the setting, locations, and relevant dates, including periods of recruitment, exposure, follow-up, and data collection</w:t>
@@ -884,7 +874,7 @@
         </w:tc>
         <w:tc>
           <w:tcPr>
-            <w:tcW w:type="dxa" w:w="2592"/>
+            <w:tcW w:type="dxa" w:w="3384"/>
             <w:tcMar>
               <w:top w:w="80" w:type="dxa"/>
               <w:bottom w:w="80" w:type="dxa"/>
@@ -900,15 +890,15 @@
           </w:tcPr>
           <w:p>
             <w:pPr>
-              <w:spacing w:after="40" w:line="240" w:lineRule="auto"/>
+              <w:jc w:val="left"/>
             </w:pPr>
             <w:r>
               <w:rPr>
-                <w:rFonts w:ascii="Times New Roman" w:hAnsi="Times New Roman"/>
-                <w:color w:val="000000"/>
+                <w:rFonts w:ascii="Cambria" w:hAnsi="Cambria"/>
+                <w:b w:val="0"/>
                 <w:sz w:val="18"/>
               </w:rPr>
-              <w:t>Section 2.1, Page 4</w:t>
+              <w:t>Section 'Study Design, Sampling, and Analytical Sample', Page 5, Lines 140–154</w:t>
             </w:r>
           </w:p>
         </w:tc>
@@ -916,7 +906,7 @@
       <w:tr>
         <w:tc>
           <w:tcPr>
-            <w:tcW w:type="dxa" w:w="1152"/>
+            <w:tcW w:type="dxa" w:w="936"/>
             <w:tcMar>
               <w:top w:w="80" w:type="dxa"/>
               <w:bottom w:w="80" w:type="dxa"/>
@@ -932,13 +922,12 @@
           </w:tcPr>
           <w:p>
             <w:pPr>
-              <w:spacing w:after="40" w:line="240" w:lineRule="auto"/>
+              <w:jc w:val="left"/>
             </w:pPr>
             <w:r>
               <w:rPr>
-                <w:rFonts w:ascii="Times New Roman" w:hAnsi="Times New Roman"/>
+                <w:rFonts w:ascii="Cambria" w:hAnsi="Cambria"/>
                 <w:b/>
-                <w:color w:val="000000"/>
                 <w:sz w:val="18"/>
               </w:rPr>
               <w:t>6</w:t>
@@ -947,7 +936,7 @@
         </w:tc>
         <w:tc>
           <w:tcPr>
-            <w:tcW w:type="dxa" w:w="2592"/>
+            <w:tcW w:type="dxa" w:w="2088"/>
             <w:tcMar>
               <w:top w:w="80" w:type="dxa"/>
               <w:bottom w:w="80" w:type="dxa"/>
@@ -963,13 +952,11 @@
           </w:tcPr>
           <w:p>
             <w:pPr>
-              <w:spacing w:after="40" w:line="240" w:lineRule="auto"/>
+              <w:jc w:val="left"/>
             </w:pPr>
             <w:r>
               <w:rPr>
-                <w:rFonts w:ascii="Times New Roman" w:hAnsi="Times New Roman"/>
-                <w:b/>
-                <w:color w:val="000000"/>
+                <w:rFonts w:ascii="Cambria" w:hAnsi="Cambria"/>
                 <w:sz w:val="18"/>
               </w:rPr>
               <w:t>Participants</w:t>
@@ -978,7 +965,7 @@
         </w:tc>
         <w:tc>
           <w:tcPr>
-            <w:tcW w:type="dxa" w:w="5184"/>
+            <w:tcW w:type="dxa" w:w="3384"/>
             <w:tcMar>
               <w:top w:w="80" w:type="dxa"/>
               <w:bottom w:w="80" w:type="dxa"/>
@@ -994,12 +981,11 @@
           </w:tcPr>
           <w:p>
             <w:pPr>
-              <w:spacing w:after="40" w:line="240" w:lineRule="auto"/>
+              <w:jc w:val="left"/>
             </w:pPr>
             <w:r>
               <w:rPr>
-                <w:rFonts w:ascii="Times New Roman" w:hAnsi="Times New Roman"/>
-                <w:color w:val="000000"/>
+                <w:rFonts w:ascii="Cambria" w:hAnsi="Cambria"/>
                 <w:sz w:val="18"/>
               </w:rPr>
               <w:t>(a) Give the eligibility criteria, and the sources and methods of selection of participants</w:t>
@@ -1008,7 +994,7 @@
         </w:tc>
         <w:tc>
           <w:tcPr>
-            <w:tcW w:type="dxa" w:w="2592"/>
+            <w:tcW w:type="dxa" w:w="3384"/>
             <w:tcMar>
               <w:top w:w="80" w:type="dxa"/>
               <w:bottom w:w="80" w:type="dxa"/>
@@ -1024,15 +1010,15 @@
           </w:tcPr>
           <w:p>
             <w:pPr>
-              <w:spacing w:after="40" w:line="240" w:lineRule="auto"/>
+              <w:jc w:val="left"/>
             </w:pPr>
             <w:r>
               <w:rPr>
-                <w:rFonts w:ascii="Times New Roman" w:hAnsi="Times New Roman"/>
-                <w:color w:val="000000"/>
+                <w:rFonts w:ascii="Cambria" w:hAnsi="Cambria"/>
+                <w:b w:val="0"/>
                 <w:sz w:val="18"/>
               </w:rPr>
-              <w:t>Section 2.1, Pages 4–5; Figure 2, Page 5</w:t>
+              <w:t>Section 'Study Design, Sampling, and Analytical Sample', Page 5, Lines 150–164; Figure 2, Page 6, Lines 165–167</w:t>
             </w:r>
           </w:p>
         </w:tc>
@@ -1040,7 +1026,7 @@
       <w:tr>
         <w:tc>
           <w:tcPr>
-            <w:tcW w:type="dxa" w:w="1152"/>
+            <w:tcW w:type="dxa" w:w="936"/>
             <w:tcMar>
               <w:top w:w="80" w:type="dxa"/>
               <w:bottom w:w="80" w:type="dxa"/>
@@ -1056,13 +1042,12 @@
           </w:tcPr>
           <w:p>
             <w:pPr>
-              <w:spacing w:after="40" w:line="240" w:lineRule="auto"/>
+              <w:jc w:val="left"/>
             </w:pPr>
             <w:r>
               <w:rPr>
-                <w:rFonts w:ascii="Times New Roman" w:hAnsi="Times New Roman"/>
+                <w:rFonts w:ascii="Cambria" w:hAnsi="Cambria"/>
                 <w:b/>
-                <w:color w:val="000000"/>
                 <w:sz w:val="18"/>
               </w:rPr>
               <w:t>7</w:t>
@@ -1071,7 +1056,7 @@
         </w:tc>
         <w:tc>
           <w:tcPr>
-            <w:tcW w:type="dxa" w:w="2592"/>
+            <w:tcW w:type="dxa" w:w="2088"/>
             <w:tcMar>
               <w:top w:w="80" w:type="dxa"/>
               <w:bottom w:w="80" w:type="dxa"/>
@@ -1087,13 +1072,11 @@
           </w:tcPr>
           <w:p>
             <w:pPr>
-              <w:spacing w:after="40" w:line="240" w:lineRule="auto"/>
+              <w:jc w:val="left"/>
             </w:pPr>
             <w:r>
               <w:rPr>
-                <w:rFonts w:ascii="Times New Roman" w:hAnsi="Times New Roman"/>
-                <w:b/>
-                <w:color w:val="000000"/>
+                <w:rFonts w:ascii="Cambria" w:hAnsi="Cambria"/>
                 <w:sz w:val="18"/>
               </w:rPr>
               <w:t>Variables</w:t>
@@ -1102,7 +1085,7 @@
         </w:tc>
         <w:tc>
           <w:tcPr>
-            <w:tcW w:type="dxa" w:w="5184"/>
+            <w:tcW w:type="dxa" w:w="3384"/>
             <w:tcMar>
               <w:top w:w="80" w:type="dxa"/>
               <w:bottom w:w="80" w:type="dxa"/>
@@ -1118,12 +1101,11 @@
           </w:tcPr>
           <w:p>
             <w:pPr>
-              <w:spacing w:after="40" w:line="240" w:lineRule="auto"/>
+              <w:jc w:val="left"/>
             </w:pPr>
             <w:r>
               <w:rPr>
-                <w:rFonts w:ascii="Times New Roman" w:hAnsi="Times New Roman"/>
-                <w:color w:val="000000"/>
+                <w:rFonts w:ascii="Cambria" w:hAnsi="Cambria"/>
                 <w:sz w:val="18"/>
               </w:rPr>
               <w:t>Clearly define all outcomes, exposures, predictors, potential confounders, and effect modifiers. Give diagnostic criteria, if applicable</w:t>
@@ -1132,7 +1114,7 @@
         </w:tc>
         <w:tc>
           <w:tcPr>
-            <w:tcW w:type="dxa" w:w="2592"/>
+            <w:tcW w:type="dxa" w:w="3384"/>
             <w:tcMar>
               <w:top w:w="80" w:type="dxa"/>
               <w:bottom w:w="80" w:type="dxa"/>
@@ -1148,15 +1130,15 @@
           </w:tcPr>
           <w:p>
             <w:pPr>
-              <w:spacing w:after="40" w:line="240" w:lineRule="auto"/>
+              <w:jc w:val="left"/>
             </w:pPr>
             <w:r>
               <w:rPr>
-                <w:rFonts w:ascii="Times New Roman" w:hAnsi="Times New Roman"/>
-                <w:color w:val="000000"/>
+                <w:rFonts w:ascii="Cambria" w:hAnsi="Cambria"/>
+                <w:b w:val="0"/>
                 <w:sz w:val="18"/>
               </w:rPr>
-              <w:t>Section 2.2 &amp; 2.3, Page 5</w:t>
+              <w:t>Section 'Outcome Variables', Pages 6–7, Lines 178–188; Section 'Explanatory Variables and conceptual Justification', Page 7, Lines 189–220</w:t>
             </w:r>
           </w:p>
         </w:tc>
@@ -1164,7 +1146,7 @@
       <w:tr>
         <w:tc>
           <w:tcPr>
-            <w:tcW w:type="dxa" w:w="1152"/>
+            <w:tcW w:type="dxa" w:w="936"/>
             <w:tcMar>
               <w:top w:w="80" w:type="dxa"/>
               <w:bottom w:w="80" w:type="dxa"/>
@@ -1180,13 +1162,12 @@
           </w:tcPr>
           <w:p>
             <w:pPr>
-              <w:spacing w:after="40" w:line="240" w:lineRule="auto"/>
+              <w:jc w:val="left"/>
             </w:pPr>
             <w:r>
               <w:rPr>
-                <w:rFonts w:ascii="Times New Roman" w:hAnsi="Times New Roman"/>
+                <w:rFonts w:ascii="Cambria" w:hAnsi="Cambria"/>
                 <w:b/>
-                <w:color w:val="000000"/>
                 <w:sz w:val="18"/>
               </w:rPr>
               <w:t>8</w:t>
@@ -1195,7 +1176,7 @@
         </w:tc>
         <w:tc>
           <w:tcPr>
-            <w:tcW w:type="dxa" w:w="2592"/>
+            <w:tcW w:type="dxa" w:w="2088"/>
             <w:tcMar>
               <w:top w:w="80" w:type="dxa"/>
               <w:bottom w:w="80" w:type="dxa"/>
@@ -1211,13 +1192,11 @@
           </w:tcPr>
           <w:p>
             <w:pPr>
-              <w:spacing w:after="40" w:line="240" w:lineRule="auto"/>
+              <w:jc w:val="left"/>
             </w:pPr>
             <w:r>
               <w:rPr>
-                <w:rFonts w:ascii="Times New Roman" w:hAnsi="Times New Roman"/>
-                <w:b/>
-                <w:color w:val="000000"/>
+                <w:rFonts w:ascii="Cambria" w:hAnsi="Cambria"/>
                 <w:sz w:val="18"/>
               </w:rPr>
               <w:t>Data sources / measurement</w:t>
@@ -1226,7 +1205,7 @@
         </w:tc>
         <w:tc>
           <w:tcPr>
-            <w:tcW w:type="dxa" w:w="5184"/>
+            <w:tcW w:type="dxa" w:w="3384"/>
             <w:tcMar>
               <w:top w:w="80" w:type="dxa"/>
               <w:bottom w:w="80" w:type="dxa"/>
@@ -1242,21 +1221,20 @@
           </w:tcPr>
           <w:p>
             <w:pPr>
-              <w:spacing w:after="40" w:line="240" w:lineRule="auto"/>
+              <w:jc w:val="left"/>
             </w:pPr>
             <w:r>
               <w:rPr>
-                <w:rFonts w:ascii="Times New Roman" w:hAnsi="Times New Roman"/>
-                <w:color w:val="000000"/>
+                <w:rFonts w:ascii="Cambria" w:hAnsi="Cambria"/>
                 <w:sz w:val="18"/>
               </w:rPr>
-              <w:t>For each variable of interest, give sources of data and details of methods of assessment (measurement)</w:t>
+              <w:t>For each variable of interest, give sources of data and details of methods of assessment (measurement). Give comparability of assessment methods if there is more than one group</w:t>
             </w:r>
           </w:p>
         </w:tc>
         <w:tc>
           <w:tcPr>
-            <w:tcW w:type="dxa" w:w="2592"/>
+            <w:tcW w:type="dxa" w:w="3384"/>
             <w:tcMar>
               <w:top w:w="80" w:type="dxa"/>
               <w:bottom w:w="80" w:type="dxa"/>
@@ -1272,15 +1250,15 @@
           </w:tcPr>
           <w:p>
             <w:pPr>
-              <w:spacing w:after="40" w:line="240" w:lineRule="auto"/>
+              <w:jc w:val="left"/>
             </w:pPr>
             <w:r>
               <w:rPr>
-                <w:rFonts w:ascii="Times New Roman" w:hAnsi="Times New Roman"/>
-                <w:color w:val="000000"/>
+                <w:rFonts w:ascii="Cambria" w:hAnsi="Cambria"/>
+                <w:b w:val="0"/>
                 <w:sz w:val="18"/>
               </w:rPr>
-              <w:t>Section 2.1, 2.2, 2.3, Pages 4–5</w:t>
+              <w:t>Section 'Study Design, Sampling, and Analytical Sample', Page 5, Lines 140–154; Section 'Outcome Variables', Pages 6–7, Lines 178–188; Section 'Explanatory Variables', Page 7, Lines 189–220</w:t>
             </w:r>
           </w:p>
         </w:tc>
@@ -1288,7 +1266,7 @@
       <w:tr>
         <w:tc>
           <w:tcPr>
-            <w:tcW w:type="dxa" w:w="1152"/>
+            <w:tcW w:type="dxa" w:w="936"/>
             <w:tcMar>
               <w:top w:w="80" w:type="dxa"/>
               <w:bottom w:w="80" w:type="dxa"/>
@@ -1304,13 +1282,12 @@
           </w:tcPr>
           <w:p>
             <w:pPr>
-              <w:spacing w:after="40" w:line="240" w:lineRule="auto"/>
+              <w:jc w:val="left"/>
             </w:pPr>
             <w:r>
               <w:rPr>
-                <w:rFonts w:ascii="Times New Roman" w:hAnsi="Times New Roman"/>
+                <w:rFonts w:ascii="Cambria" w:hAnsi="Cambria"/>
                 <w:b/>
-                <w:color w:val="000000"/>
                 <w:sz w:val="18"/>
               </w:rPr>
               <w:t>9</w:t>
@@ -1319,7 +1296,7 @@
         </w:tc>
         <w:tc>
           <w:tcPr>
-            <w:tcW w:type="dxa" w:w="2592"/>
+            <w:tcW w:type="dxa" w:w="2088"/>
             <w:tcMar>
               <w:top w:w="80" w:type="dxa"/>
               <w:bottom w:w="80" w:type="dxa"/>
@@ -1335,13 +1312,11 @@
           </w:tcPr>
           <w:p>
             <w:pPr>
-              <w:spacing w:after="40" w:line="240" w:lineRule="auto"/>
+              <w:jc w:val="left"/>
             </w:pPr>
             <w:r>
               <w:rPr>
-                <w:rFonts w:ascii="Times New Roman" w:hAnsi="Times New Roman"/>
-                <w:b/>
-                <w:color w:val="000000"/>
+                <w:rFonts w:ascii="Cambria" w:hAnsi="Cambria"/>
                 <w:sz w:val="18"/>
               </w:rPr>
               <w:t>Bias</w:t>
@@ -1350,7 +1325,7 @@
         </w:tc>
         <w:tc>
           <w:tcPr>
-            <w:tcW w:type="dxa" w:w="5184"/>
+            <w:tcW w:type="dxa" w:w="3384"/>
             <w:tcMar>
               <w:top w:w="80" w:type="dxa"/>
               <w:bottom w:w="80" w:type="dxa"/>
@@ -1366,12 +1341,11 @@
           </w:tcPr>
           <w:p>
             <w:pPr>
-              <w:spacing w:after="40" w:line="240" w:lineRule="auto"/>
+              <w:jc w:val="left"/>
             </w:pPr>
             <w:r>
               <w:rPr>
-                <w:rFonts w:ascii="Times New Roman" w:hAnsi="Times New Roman"/>
-                <w:color w:val="000000"/>
+                <w:rFonts w:ascii="Cambria" w:hAnsi="Cambria"/>
                 <w:sz w:val="18"/>
               </w:rPr>
               <w:t>Describe any efforts to address potential sources of bias</w:t>
@@ -1380,7 +1354,7 @@
         </w:tc>
         <w:tc>
           <w:tcPr>
-            <w:tcW w:type="dxa" w:w="2592"/>
+            <w:tcW w:type="dxa" w:w="3384"/>
             <w:tcMar>
               <w:top w:w="80" w:type="dxa"/>
               <w:bottom w:w="80" w:type="dxa"/>
@@ -1396,15 +1370,15 @@
           </w:tcPr>
           <w:p>
             <w:pPr>
-              <w:spacing w:after="40" w:line="240" w:lineRule="auto"/>
+              <w:jc w:val="left"/>
             </w:pPr>
             <w:r>
               <w:rPr>
-                <w:rFonts w:ascii="Times New Roman" w:hAnsi="Times New Roman"/>
-                <w:color w:val="000000"/>
+                <w:rFonts w:ascii="Cambria" w:hAnsi="Cambria"/>
+                <w:b w:val="0"/>
                 <w:sz w:val="18"/>
               </w:rPr>
-              <w:t>Section 2.1, Page 5; Section 4, Page 12</w:t>
+              <w:t>Section 'Study Design, Sampling, and Analytical Sample', Page 5, Lines 161–164; Section 'Discussion' (Strengths and limitations), Pages 19–20, Lines 443–454</w:t>
             </w:r>
           </w:p>
         </w:tc>
@@ -1412,7 +1386,7 @@
       <w:tr>
         <w:tc>
           <w:tcPr>
-            <w:tcW w:type="dxa" w:w="1152"/>
+            <w:tcW w:type="dxa" w:w="936"/>
             <w:tcMar>
               <w:top w:w="80" w:type="dxa"/>
               <w:bottom w:w="80" w:type="dxa"/>
@@ -1428,13 +1402,12 @@
           </w:tcPr>
           <w:p>
             <w:pPr>
-              <w:spacing w:after="40" w:line="240" w:lineRule="auto"/>
+              <w:jc w:val="left"/>
             </w:pPr>
             <w:r>
               <w:rPr>
-                <w:rFonts w:ascii="Times New Roman" w:hAnsi="Times New Roman"/>
+                <w:rFonts w:ascii="Cambria" w:hAnsi="Cambria"/>
                 <w:b/>
-                <w:color w:val="000000"/>
                 <w:sz w:val="18"/>
               </w:rPr>
               <w:t>10</w:t>
@@ -1443,7 +1416,7 @@
         </w:tc>
         <w:tc>
           <w:tcPr>
-            <w:tcW w:type="dxa" w:w="2592"/>
+            <w:tcW w:type="dxa" w:w="2088"/>
             <w:tcMar>
               <w:top w:w="80" w:type="dxa"/>
               <w:bottom w:w="80" w:type="dxa"/>
@@ -1459,13 +1432,11 @@
           </w:tcPr>
           <w:p>
             <w:pPr>
-              <w:spacing w:after="40" w:line="240" w:lineRule="auto"/>
+              <w:jc w:val="left"/>
             </w:pPr>
             <w:r>
               <w:rPr>
-                <w:rFonts w:ascii="Times New Roman" w:hAnsi="Times New Roman"/>
-                <w:b/>
-                <w:color w:val="000000"/>
+                <w:rFonts w:ascii="Cambria" w:hAnsi="Cambria"/>
                 <w:sz w:val="18"/>
               </w:rPr>
               <w:t>Study size</w:t>
@@ -1474,7 +1445,7 @@
         </w:tc>
         <w:tc>
           <w:tcPr>
-            <w:tcW w:type="dxa" w:w="5184"/>
+            <w:tcW w:type="dxa" w:w="3384"/>
             <w:tcMar>
               <w:top w:w="80" w:type="dxa"/>
               <w:bottom w:w="80" w:type="dxa"/>
@@ -1490,12 +1461,11 @@
           </w:tcPr>
           <w:p>
             <w:pPr>
-              <w:spacing w:after="40" w:line="240" w:lineRule="auto"/>
+              <w:jc w:val="left"/>
             </w:pPr>
             <w:r>
               <w:rPr>
-                <w:rFonts w:ascii="Times New Roman" w:hAnsi="Times New Roman"/>
-                <w:color w:val="000000"/>
+                <w:rFonts w:ascii="Cambria" w:hAnsi="Cambria"/>
                 <w:sz w:val="18"/>
               </w:rPr>
               <w:t>Explain how the study size was arrived at</w:t>
@@ -1504,7 +1474,7 @@
         </w:tc>
         <w:tc>
           <w:tcPr>
-            <w:tcW w:type="dxa" w:w="2592"/>
+            <w:tcW w:type="dxa" w:w="3384"/>
             <w:tcMar>
               <w:top w:w="80" w:type="dxa"/>
               <w:bottom w:w="80" w:type="dxa"/>
@@ -1520,15 +1490,15 @@
           </w:tcPr>
           <w:p>
             <w:pPr>
-              <w:spacing w:after="40" w:line="240" w:lineRule="auto"/>
+              <w:jc w:val="left"/>
             </w:pPr>
             <w:r>
               <w:rPr>
-                <w:rFonts w:ascii="Times New Roman" w:hAnsi="Times New Roman"/>
-                <w:color w:val="000000"/>
+                <w:rFonts w:ascii="Cambria" w:hAnsi="Cambria"/>
+                <w:b w:val="0"/>
                 <w:sz w:val="18"/>
               </w:rPr>
-              <w:t>Section 2.1, Pages 4–5; Figure 2, Page 5</w:t>
+              <w:t>Section 'Study Design, Sampling, and Analytical Sample', Page 5, Lines 140–164; Figure 2, Page 6, Lines 165–167</w:t>
             </w:r>
           </w:p>
         </w:tc>
@@ -1536,7 +1506,7 @@
       <w:tr>
         <w:tc>
           <w:tcPr>
-            <w:tcW w:type="dxa" w:w="1152"/>
+            <w:tcW w:type="dxa" w:w="936"/>
             <w:tcMar>
               <w:top w:w="80" w:type="dxa"/>
               <w:bottom w:w="80" w:type="dxa"/>
@@ -1552,13 +1522,12 @@
           </w:tcPr>
           <w:p>
             <w:pPr>
-              <w:spacing w:after="40" w:line="240" w:lineRule="auto"/>
+              <w:jc w:val="left"/>
             </w:pPr>
             <w:r>
               <w:rPr>
-                <w:rFonts w:ascii="Times New Roman" w:hAnsi="Times New Roman"/>
+                <w:rFonts w:ascii="Cambria" w:hAnsi="Cambria"/>
                 <w:b/>
-                <w:color w:val="000000"/>
                 <w:sz w:val="18"/>
               </w:rPr>
               <w:t>11</w:t>
@@ -1567,7 +1536,7 @@
         </w:tc>
         <w:tc>
           <w:tcPr>
-            <w:tcW w:type="dxa" w:w="2592"/>
+            <w:tcW w:type="dxa" w:w="2088"/>
             <w:tcMar>
               <w:top w:w="80" w:type="dxa"/>
               <w:bottom w:w="80" w:type="dxa"/>
@@ -1583,13 +1552,11 @@
           </w:tcPr>
           <w:p>
             <w:pPr>
-              <w:spacing w:after="40" w:line="240" w:lineRule="auto"/>
+              <w:jc w:val="left"/>
             </w:pPr>
             <w:r>
               <w:rPr>
-                <w:rFonts w:ascii="Times New Roman" w:hAnsi="Times New Roman"/>
-                <w:b/>
-                <w:color w:val="000000"/>
+                <w:rFonts w:ascii="Cambria" w:hAnsi="Cambria"/>
                 <w:sz w:val="18"/>
               </w:rPr>
               <w:t>Quantitative variables</w:t>
@@ -1598,7 +1565,7 @@
         </w:tc>
         <w:tc>
           <w:tcPr>
-            <w:tcW w:type="dxa" w:w="5184"/>
+            <w:tcW w:type="dxa" w:w="3384"/>
             <w:tcMar>
               <w:top w:w="80" w:type="dxa"/>
               <w:bottom w:w="80" w:type="dxa"/>
@@ -1614,12 +1581,11 @@
           </w:tcPr>
           <w:p>
             <w:pPr>
-              <w:spacing w:after="40" w:line="240" w:lineRule="auto"/>
+              <w:jc w:val="left"/>
             </w:pPr>
             <w:r>
               <w:rPr>
-                <w:rFonts w:ascii="Times New Roman" w:hAnsi="Times New Roman"/>
-                <w:color w:val="000000"/>
+                <w:rFonts w:ascii="Cambria" w:hAnsi="Cambria"/>
                 <w:sz w:val="18"/>
               </w:rPr>
               <w:t>Explain how quantitative variables were handled in the analyses. If applicable, describe which groupings were chosen and why</w:t>
@@ -1628,7 +1594,7 @@
         </w:tc>
         <w:tc>
           <w:tcPr>
-            <w:tcW w:type="dxa" w:w="2592"/>
+            <w:tcW w:type="dxa" w:w="3384"/>
             <w:tcMar>
               <w:top w:w="80" w:type="dxa"/>
               <w:bottom w:w="80" w:type="dxa"/>
@@ -1644,15 +1610,15 @@
           </w:tcPr>
           <w:p>
             <w:pPr>
-              <w:spacing w:after="40" w:line="240" w:lineRule="auto"/>
+              <w:jc w:val="left"/>
             </w:pPr>
             <w:r>
               <w:rPr>
-                <w:rFonts w:ascii="Times New Roman" w:hAnsi="Times New Roman"/>
-                <w:color w:val="000000"/>
+                <w:rFonts w:ascii="Cambria" w:hAnsi="Cambria"/>
+                <w:b w:val="0"/>
                 <w:sz w:val="18"/>
               </w:rPr>
-              <w:t>Section 2.3, Page 5</w:t>
+              <w:t>Section 'Outcome Variables', Pages 6–7, Lines 178–188; Section 'Explanatory Variables and conceptual Justification', Page 7, Lines 189–220; Table 1, Pages 9–11, Line 281</w:t>
             </w:r>
           </w:p>
         </w:tc>
@@ -1660,7 +1626,7 @@
       <w:tr>
         <w:tc>
           <w:tcPr>
-            <w:tcW w:type="dxa" w:w="1152"/>
+            <w:tcW w:type="dxa" w:w="936"/>
             <w:tcMar>
               <w:top w:w="80" w:type="dxa"/>
               <w:bottom w:w="80" w:type="dxa"/>
@@ -1676,13 +1642,12 @@
           </w:tcPr>
           <w:p>
             <w:pPr>
-              <w:spacing w:after="40" w:line="240" w:lineRule="auto"/>
+              <w:jc w:val="left"/>
             </w:pPr>
             <w:r>
               <w:rPr>
-                <w:rFonts w:ascii="Times New Roman" w:hAnsi="Times New Roman"/>
+                <w:rFonts w:ascii="Cambria" w:hAnsi="Cambria"/>
                 <w:b/>
-                <w:color w:val="000000"/>
                 <w:sz w:val="18"/>
               </w:rPr>
               <w:t>12</w:t>
@@ -1691,7 +1656,7 @@
         </w:tc>
         <w:tc>
           <w:tcPr>
-            <w:tcW w:type="dxa" w:w="2592"/>
+            <w:tcW w:type="dxa" w:w="2088"/>
             <w:tcMar>
               <w:top w:w="80" w:type="dxa"/>
               <w:bottom w:w="80" w:type="dxa"/>
@@ -1707,13 +1672,11 @@
           </w:tcPr>
           <w:p>
             <w:pPr>
-              <w:spacing w:after="40" w:line="240" w:lineRule="auto"/>
+              <w:jc w:val="left"/>
             </w:pPr>
             <w:r>
               <w:rPr>
-                <w:rFonts w:ascii="Times New Roman" w:hAnsi="Times New Roman"/>
-                <w:b/>
-                <w:color w:val="000000"/>
+                <w:rFonts w:ascii="Cambria" w:hAnsi="Cambria"/>
                 <w:sz w:val="18"/>
               </w:rPr>
               <w:t>Statistical methods</w:t>
@@ -1722,7 +1685,7 @@
         </w:tc>
         <w:tc>
           <w:tcPr>
-            <w:tcW w:type="dxa" w:w="5184"/>
+            <w:tcW w:type="dxa" w:w="3384"/>
             <w:tcMar>
               <w:top w:w="80" w:type="dxa"/>
               <w:bottom w:w="80" w:type="dxa"/>
@@ -1738,12 +1701,11 @@
           </w:tcPr>
           <w:p>
             <w:pPr>
-              <w:spacing w:after="40" w:line="240" w:lineRule="auto"/>
+              <w:jc w:val="left"/>
             </w:pPr>
             <w:r>
               <w:rPr>
-                <w:rFonts w:ascii="Times New Roman" w:hAnsi="Times New Roman"/>
-                <w:color w:val="000000"/>
+                <w:rFonts w:ascii="Cambria" w:hAnsi="Cambria"/>
                 <w:sz w:val="18"/>
               </w:rPr>
               <w:t>(a) Describe all statistical methods, including those used to control for confounding</w:t>
@@ -1752,7 +1714,7 @@
         </w:tc>
         <w:tc>
           <w:tcPr>
-            <w:tcW w:type="dxa" w:w="2592"/>
+            <w:tcW w:type="dxa" w:w="3384"/>
             <w:tcMar>
               <w:top w:w="80" w:type="dxa"/>
               <w:bottom w:w="80" w:type="dxa"/>
@@ -1768,15 +1730,15 @@
           </w:tcPr>
           <w:p>
             <w:pPr>
-              <w:spacing w:after="40" w:line="240" w:lineRule="auto"/>
+              <w:jc w:val="left"/>
             </w:pPr>
             <w:r>
               <w:rPr>
-                <w:rFonts w:ascii="Times New Roman" w:hAnsi="Times New Roman"/>
-                <w:color w:val="000000"/>
+                <w:rFonts w:ascii="Cambria" w:hAnsi="Cambria"/>
+                <w:b w:val="0"/>
                 <w:sz w:val="18"/>
               </w:rPr>
-              <w:t>Section 2.4 &amp; 2.5, Pages 5–6</w:t>
+              <w:t>Section 'Statistical analysis', Pages 7–8, Lines 221–231; Section 'Multilevel logistic regression using a frequentist approach', Page 8, Lines 232–251</w:t>
             </w:r>
           </w:p>
         </w:tc>
@@ -1784,7 +1746,7 @@
       <w:tr>
         <w:tc>
           <w:tcPr>
-            <w:tcW w:type="dxa" w:w="1152"/>
+            <w:tcW w:type="dxa" w:w="936"/>
             <w:tcMar>
               <w:top w:w="80" w:type="dxa"/>
               <w:bottom w:w="80" w:type="dxa"/>
@@ -1800,12 +1762,12 @@
           </w:tcPr>
           <w:p>
             <w:pPr>
-              <w:spacing w:after="40" w:line="240" w:lineRule="auto"/>
+              <w:jc w:val="left"/>
             </w:pPr>
             <w:r>
               <w:rPr>
-                <w:rFonts w:ascii="Times New Roman" w:hAnsi="Times New Roman"/>
-                <w:color w:val="000000"/>
+                <w:rFonts w:ascii="Cambria" w:hAnsi="Cambria"/>
+                <w:b/>
                 <w:sz w:val="18"/>
               </w:rPr>
             </w:r>
@@ -1813,7 +1775,7 @@
         </w:tc>
         <w:tc>
           <w:tcPr>
-            <w:tcW w:type="dxa" w:w="2592"/>
+            <w:tcW w:type="dxa" w:w="2088"/>
             <w:tcMar>
               <w:top w:w="80" w:type="dxa"/>
               <w:bottom w:w="80" w:type="dxa"/>
@@ -1829,12 +1791,11 @@
           </w:tcPr>
           <w:p>
             <w:pPr>
-              <w:spacing w:after="40" w:line="240" w:lineRule="auto"/>
+              <w:jc w:val="left"/>
             </w:pPr>
             <w:r>
               <w:rPr>
-                <w:rFonts w:ascii="Times New Roman" w:hAnsi="Times New Roman"/>
-                <w:color w:val="000000"/>
+                <w:rFonts w:ascii="Cambria" w:hAnsi="Cambria"/>
                 <w:sz w:val="18"/>
               </w:rPr>
             </w:r>
@@ -1842,7 +1803,7 @@
         </w:tc>
         <w:tc>
           <w:tcPr>
-            <w:tcW w:type="dxa" w:w="5184"/>
+            <w:tcW w:type="dxa" w:w="3384"/>
             <w:tcMar>
               <w:top w:w="80" w:type="dxa"/>
               <w:bottom w:w="80" w:type="dxa"/>
@@ -1858,12 +1819,11 @@
           </w:tcPr>
           <w:p>
             <w:pPr>
-              <w:spacing w:after="40" w:line="240" w:lineRule="auto"/>
+              <w:jc w:val="left"/>
             </w:pPr>
             <w:r>
               <w:rPr>
-                <w:rFonts w:ascii="Times New Roman" w:hAnsi="Times New Roman"/>
-                <w:color w:val="000000"/>
+                <w:rFonts w:ascii="Cambria" w:hAnsi="Cambria"/>
                 <w:sz w:val="18"/>
               </w:rPr>
               <w:t>(b) Describe any methods used to examine subgroups and interactions</w:t>
@@ -1872,7 +1832,7 @@
         </w:tc>
         <w:tc>
           <w:tcPr>
-            <w:tcW w:type="dxa" w:w="2592"/>
+            <w:tcW w:type="dxa" w:w="3384"/>
             <w:tcMar>
               <w:top w:w="80" w:type="dxa"/>
               <w:bottom w:w="80" w:type="dxa"/>
@@ -1888,15 +1848,15 @@
           </w:tcPr>
           <w:p>
             <w:pPr>
-              <w:spacing w:after="40" w:line="240" w:lineRule="auto"/>
+              <w:jc w:val="left"/>
             </w:pPr>
             <w:r>
               <w:rPr>
-                <w:rFonts w:ascii="Times New Roman" w:hAnsi="Times New Roman"/>
-                <w:color w:val="000000"/>
+                <w:rFonts w:ascii="Cambria" w:hAnsi="Cambria"/>
+                <w:b w:val="0"/>
                 <w:sz w:val="18"/>
               </w:rPr>
-              <w:t>Section 2.4 &amp; 2.5, Pages 5–6</w:t>
+              <w:t>Section 'Statistical analysis', Pages 7–8, Lines 221–231; Section 'Multilevel logistic regression using a frequentist approach', Page 8, Lines 232–251; Table 1 &amp; Table 2, Pages 9–12</w:t>
             </w:r>
           </w:p>
         </w:tc>
@@ -1904,7 +1864,7 @@
       <w:tr>
         <w:tc>
           <w:tcPr>
-            <w:tcW w:type="dxa" w:w="1152"/>
+            <w:tcW w:type="dxa" w:w="936"/>
             <w:tcMar>
               <w:top w:w="80" w:type="dxa"/>
               <w:bottom w:w="80" w:type="dxa"/>
@@ -1920,12 +1880,12 @@
           </w:tcPr>
           <w:p>
             <w:pPr>
-              <w:spacing w:after="40" w:line="240" w:lineRule="auto"/>
+              <w:jc w:val="left"/>
             </w:pPr>
             <w:r>
               <w:rPr>
-                <w:rFonts w:ascii="Times New Roman" w:hAnsi="Times New Roman"/>
-                <w:color w:val="000000"/>
+                <w:rFonts w:ascii="Cambria" w:hAnsi="Cambria"/>
+                <w:b/>
                 <w:sz w:val="18"/>
               </w:rPr>
             </w:r>
@@ -1933,7 +1893,7 @@
         </w:tc>
         <w:tc>
           <w:tcPr>
-            <w:tcW w:type="dxa" w:w="2592"/>
+            <w:tcW w:type="dxa" w:w="2088"/>
             <w:tcMar>
               <w:top w:w="80" w:type="dxa"/>
               <w:bottom w:w="80" w:type="dxa"/>
@@ -1949,12 +1909,11 @@
           </w:tcPr>
           <w:p>
             <w:pPr>
-              <w:spacing w:after="40" w:line="240" w:lineRule="auto"/>
+              <w:jc w:val="left"/>
             </w:pPr>
             <w:r>
               <w:rPr>
-                <w:rFonts w:ascii="Times New Roman" w:hAnsi="Times New Roman"/>
-                <w:color w:val="000000"/>
+                <w:rFonts w:ascii="Cambria" w:hAnsi="Cambria"/>
                 <w:sz w:val="18"/>
               </w:rPr>
             </w:r>
@@ -1962,7 +1921,7 @@
         </w:tc>
         <w:tc>
           <w:tcPr>
-            <w:tcW w:type="dxa" w:w="5184"/>
+            <w:tcW w:type="dxa" w:w="3384"/>
             <w:tcMar>
               <w:top w:w="80" w:type="dxa"/>
               <w:bottom w:w="80" w:type="dxa"/>
@@ -1978,12 +1937,11 @@
           </w:tcPr>
           <w:p>
             <w:pPr>
-              <w:spacing w:after="40" w:line="240" w:lineRule="auto"/>
+              <w:jc w:val="left"/>
             </w:pPr>
             <w:r>
               <w:rPr>
-                <w:rFonts w:ascii="Times New Roman" w:hAnsi="Times New Roman"/>
-                <w:color w:val="000000"/>
+                <w:rFonts w:ascii="Cambria" w:hAnsi="Cambria"/>
                 <w:sz w:val="18"/>
               </w:rPr>
               <w:t>(c) Explain how missing data were addressed</w:t>
@@ -1992,7 +1950,7 @@
         </w:tc>
         <w:tc>
           <w:tcPr>
-            <w:tcW w:type="dxa" w:w="2592"/>
+            <w:tcW w:type="dxa" w:w="3384"/>
             <w:tcMar>
               <w:top w:w="80" w:type="dxa"/>
               <w:bottom w:w="80" w:type="dxa"/>
@@ -2008,15 +1966,15 @@
           </w:tcPr>
           <w:p>
             <w:pPr>
-              <w:spacing w:after="40" w:line="240" w:lineRule="auto"/>
+              <w:jc w:val="left"/>
             </w:pPr>
             <w:r>
               <w:rPr>
-                <w:rFonts w:ascii="Times New Roman" w:hAnsi="Times New Roman"/>
-                <w:color w:val="000000"/>
+                <w:rFonts w:ascii="Cambria" w:hAnsi="Cambria"/>
+                <w:b w:val="0"/>
                 <w:sz w:val="18"/>
               </w:rPr>
-              <w:t>Section 2.1, Page 5; Figure 2, Page 5</w:t>
+              <w:t>Section 'Study Design, Sampling, and Analytical Sample', Page 5, Lines 161–164; Figure 2, Page 6, Lines 165–167</w:t>
             </w:r>
           </w:p>
         </w:tc>
@@ -2024,7 +1982,7 @@
       <w:tr>
         <w:tc>
           <w:tcPr>
-            <w:tcW w:type="dxa" w:w="1152"/>
+            <w:tcW w:type="dxa" w:w="936"/>
             <w:tcMar>
               <w:top w:w="80" w:type="dxa"/>
               <w:bottom w:w="80" w:type="dxa"/>
@@ -2040,12 +1998,12 @@
           </w:tcPr>
           <w:p>
             <w:pPr>
-              <w:spacing w:after="40" w:line="240" w:lineRule="auto"/>
+              <w:jc w:val="left"/>
             </w:pPr>
             <w:r>
               <w:rPr>
-                <w:rFonts w:ascii="Times New Roman" w:hAnsi="Times New Roman"/>
-                <w:color w:val="000000"/>
+                <w:rFonts w:ascii="Cambria" w:hAnsi="Cambria"/>
+                <w:b/>
                 <w:sz w:val="18"/>
               </w:rPr>
             </w:r>
@@ -2053,7 +2011,7 @@
         </w:tc>
         <w:tc>
           <w:tcPr>
-            <w:tcW w:type="dxa" w:w="2592"/>
+            <w:tcW w:type="dxa" w:w="2088"/>
             <w:tcMar>
               <w:top w:w="80" w:type="dxa"/>
               <w:bottom w:w="80" w:type="dxa"/>
@@ -2069,12 +2027,11 @@
           </w:tcPr>
           <w:p>
             <w:pPr>
-              <w:spacing w:after="40" w:line="240" w:lineRule="auto"/>
+              <w:jc w:val="left"/>
             </w:pPr>
             <w:r>
               <w:rPr>
-                <w:rFonts w:ascii="Times New Roman" w:hAnsi="Times New Roman"/>
-                <w:color w:val="000000"/>
+                <w:rFonts w:ascii="Cambria" w:hAnsi="Cambria"/>
                 <w:sz w:val="18"/>
               </w:rPr>
             </w:r>
@@ -2082,7 +2039,7 @@
         </w:tc>
         <w:tc>
           <w:tcPr>
-            <w:tcW w:type="dxa" w:w="5184"/>
+            <w:tcW w:type="dxa" w:w="3384"/>
             <w:tcMar>
               <w:top w:w="80" w:type="dxa"/>
               <w:bottom w:w="80" w:type="dxa"/>
@@ -2098,12 +2055,11 @@
           </w:tcPr>
           <w:p>
             <w:pPr>
-              <w:spacing w:after="40" w:line="240" w:lineRule="auto"/>
+              <w:jc w:val="left"/>
             </w:pPr>
             <w:r>
               <w:rPr>
-                <w:rFonts w:ascii="Times New Roman" w:hAnsi="Times New Roman"/>
-                <w:color w:val="000000"/>
+                <w:rFonts w:ascii="Cambria" w:hAnsi="Cambria"/>
                 <w:sz w:val="18"/>
               </w:rPr>
               <w:t>(d) If applicable, describe analytical methods taking account of sampling strategy</w:t>
@@ -2112,7 +2068,7 @@
         </w:tc>
         <w:tc>
           <w:tcPr>
-            <w:tcW w:type="dxa" w:w="2592"/>
+            <w:tcW w:type="dxa" w:w="3384"/>
             <w:tcMar>
               <w:top w:w="80" w:type="dxa"/>
               <w:bottom w:w="80" w:type="dxa"/>
@@ -2128,15 +2084,15 @@
           </w:tcPr>
           <w:p>
             <w:pPr>
-              <w:spacing w:after="40" w:line="240" w:lineRule="auto"/>
+              <w:jc w:val="left"/>
             </w:pPr>
             <w:r>
               <w:rPr>
-                <w:rFonts w:ascii="Times New Roman" w:hAnsi="Times New Roman"/>
-                <w:color w:val="000000"/>
+                <w:rFonts w:ascii="Cambria" w:hAnsi="Cambria"/>
+                <w:b w:val="0"/>
                 <w:sz w:val="18"/>
               </w:rPr>
-              <w:t>Section 2.4 &amp; 2.5, Pages 5–6</w:t>
+              <w:t>Section 'Statistical analysis' (Survey weighting, stratification, PSU clustering), Pages 7–8, Lines 221–231; Section 'Multilevel logistic regression', Page 8, Lines 232–251</w:t>
             </w:r>
           </w:p>
         </w:tc>
@@ -2144,7 +2100,7 @@
       <w:tr>
         <w:tc>
           <w:tcPr>
-            <w:tcW w:type="dxa" w:w="1152"/>
+            <w:tcW w:type="dxa" w:w="936"/>
             <w:tcMar>
               <w:top w:w="80" w:type="dxa"/>
               <w:bottom w:w="80" w:type="dxa"/>
@@ -2160,12 +2116,12 @@
           </w:tcPr>
           <w:p>
             <w:pPr>
-              <w:spacing w:after="40" w:line="240" w:lineRule="auto"/>
+              <w:jc w:val="left"/>
             </w:pPr>
             <w:r>
               <w:rPr>
-                <w:rFonts w:ascii="Times New Roman" w:hAnsi="Times New Roman"/>
-                <w:color w:val="000000"/>
+                <w:rFonts w:ascii="Cambria" w:hAnsi="Cambria"/>
+                <w:b/>
                 <w:sz w:val="18"/>
               </w:rPr>
             </w:r>
@@ -2173,7 +2129,7 @@
         </w:tc>
         <w:tc>
           <w:tcPr>
-            <w:tcW w:type="dxa" w:w="2592"/>
+            <w:tcW w:type="dxa" w:w="2088"/>
             <w:tcMar>
               <w:top w:w="80" w:type="dxa"/>
               <w:bottom w:w="80" w:type="dxa"/>
@@ -2189,12 +2145,11 @@
           </w:tcPr>
           <w:p>
             <w:pPr>
-              <w:spacing w:after="40" w:line="240" w:lineRule="auto"/>
+              <w:jc w:val="left"/>
             </w:pPr>
             <w:r>
               <w:rPr>
-                <w:rFonts w:ascii="Times New Roman" w:hAnsi="Times New Roman"/>
-                <w:color w:val="000000"/>
+                <w:rFonts w:ascii="Cambria" w:hAnsi="Cambria"/>
                 <w:sz w:val="18"/>
               </w:rPr>
             </w:r>
@@ -2202,7 +2157,7 @@
         </w:tc>
         <w:tc>
           <w:tcPr>
-            <w:tcW w:type="dxa" w:w="5184"/>
+            <w:tcW w:type="dxa" w:w="3384"/>
             <w:tcMar>
               <w:top w:w="80" w:type="dxa"/>
               <w:bottom w:w="80" w:type="dxa"/>
@@ -2218,12 +2173,11 @@
           </w:tcPr>
           <w:p>
             <w:pPr>
-              <w:spacing w:after="40" w:line="240" w:lineRule="auto"/>
+              <w:jc w:val="left"/>
             </w:pPr>
             <w:r>
               <w:rPr>
-                <w:rFonts w:ascii="Times New Roman" w:hAnsi="Times New Roman"/>
-                <w:color w:val="000000"/>
+                <w:rFonts w:ascii="Cambria" w:hAnsi="Cambria"/>
                 <w:sz w:val="18"/>
               </w:rPr>
               <w:t>(e) Describe any sensitivity analyses</w:t>
@@ -2232,7 +2186,7 @@
         </w:tc>
         <w:tc>
           <w:tcPr>
-            <w:tcW w:type="dxa" w:w="2592"/>
+            <w:tcW w:type="dxa" w:w="3384"/>
             <w:tcMar>
               <w:top w:w="80" w:type="dxa"/>
               <w:bottom w:w="80" w:type="dxa"/>
@@ -2248,15 +2202,15 @@
           </w:tcPr>
           <w:p>
             <w:pPr>
-              <w:spacing w:after="40" w:line="240" w:lineRule="auto"/>
+              <w:jc w:val="left"/>
             </w:pPr>
             <w:r>
               <w:rPr>
-                <w:rFonts w:ascii="Times New Roman" w:hAnsi="Times New Roman"/>
-                <w:color w:val="000000"/>
+                <w:rFonts w:ascii="Cambria" w:hAnsi="Cambria"/>
+                <w:b w:val="0"/>
                 <w:sz w:val="18"/>
               </w:rPr>
-              <w:t>Section 2.5, Page 6; Table S1–S4</w:t>
+              <w:t>Section 'Multilevel logistic regression using a frequentist approach', Page 8, Lines 232–251; Adjusted GVIF multicollinearity diagnostic, Page 7, Lines 212–219; Supplementary Tables S1–S4</w:t>
             </w:r>
           </w:p>
         </w:tc>
@@ -2264,7 +2218,7 @@
       <w:tr>
         <w:tc>
           <w:tcPr>
-            <w:tcW w:type="dxa" w:w="1152"/>
+            <w:tcW w:type="dxa" w:w="936"/>
             <w:tcMar>
               <w:top w:w="80" w:type="dxa"/>
               <w:bottom w:w="80" w:type="dxa"/>
@@ -2280,13 +2234,12 @@
           </w:tcPr>
           <w:p>
             <w:pPr>
-              <w:spacing w:after="40" w:line="240" w:lineRule="auto"/>
+              <w:jc w:val="left"/>
             </w:pPr>
             <w:r>
               <w:rPr>
-                <w:rFonts w:ascii="Times New Roman" w:hAnsi="Times New Roman"/>
+                <w:rFonts w:ascii="Cambria" w:hAnsi="Cambria"/>
                 <w:b/>
-                <w:color w:val="000000"/>
                 <w:sz w:val="18"/>
               </w:rPr>
               <w:t>13</w:t>
@@ -2295,7 +2248,7 @@
         </w:tc>
         <w:tc>
           <w:tcPr>
-            <w:tcW w:type="dxa" w:w="2592"/>
+            <w:tcW w:type="dxa" w:w="2088"/>
             <w:tcMar>
               <w:top w:w="80" w:type="dxa"/>
               <w:bottom w:w="80" w:type="dxa"/>
@@ -2311,13 +2264,11 @@
           </w:tcPr>
           <w:p>
             <w:pPr>
-              <w:spacing w:after="40" w:line="240" w:lineRule="auto"/>
+              <w:jc w:val="left"/>
             </w:pPr>
             <w:r>
               <w:rPr>
-                <w:rFonts w:ascii="Times New Roman" w:hAnsi="Times New Roman"/>
-                <w:b/>
-                <w:color w:val="000000"/>
+                <w:rFonts w:ascii="Cambria" w:hAnsi="Cambria"/>
                 <w:sz w:val="18"/>
               </w:rPr>
               <w:t>Participants</w:t>
@@ -2326,7 +2277,7 @@
         </w:tc>
         <w:tc>
           <w:tcPr>
-            <w:tcW w:type="dxa" w:w="5184"/>
+            <w:tcW w:type="dxa" w:w="3384"/>
             <w:tcMar>
               <w:top w:w="80" w:type="dxa"/>
               <w:bottom w:w="80" w:type="dxa"/>
@@ -2342,12 +2293,11 @@
           </w:tcPr>
           <w:p>
             <w:pPr>
-              <w:spacing w:after="40" w:line="240" w:lineRule="auto"/>
+              <w:jc w:val="left"/>
             </w:pPr>
             <w:r>
               <w:rPr>
-                <w:rFonts w:ascii="Times New Roman" w:hAnsi="Times New Roman"/>
-                <w:color w:val="000000"/>
+                <w:rFonts w:ascii="Cambria" w:hAnsi="Cambria"/>
                 <w:sz w:val="18"/>
               </w:rPr>
               <w:t>(a) Report numbers of individuals at each stage of study—eg numbers potentially eligible, examined for eligibility, confirmed eligible, included in the study, completing follow-up, and analysed</w:t>
@@ -2356,7 +2306,7 @@
         </w:tc>
         <w:tc>
           <w:tcPr>
-            <w:tcW w:type="dxa" w:w="2592"/>
+            <w:tcW w:type="dxa" w:w="3384"/>
             <w:tcMar>
               <w:top w:w="80" w:type="dxa"/>
               <w:bottom w:w="80" w:type="dxa"/>
@@ -2372,15 +2322,15 @@
           </w:tcPr>
           <w:p>
             <w:pPr>
-              <w:spacing w:after="40" w:line="240" w:lineRule="auto"/>
+              <w:jc w:val="left"/>
             </w:pPr>
             <w:r>
               <w:rPr>
-                <w:rFonts w:ascii="Times New Roman" w:hAnsi="Times New Roman"/>
-                <w:color w:val="000000"/>
+                <w:rFonts w:ascii="Cambria" w:hAnsi="Cambria"/>
+                <w:b w:val="0"/>
                 <w:sz w:val="18"/>
               </w:rPr>
-              <w:t>Section 2.1, Pages 4–5; Figure 2, Page 5</w:t>
+              <w:t>Section 'Study Design, Sampling, and Analytical Sample', Page 5, Lines 150–164; Figure 2, Page 6, Lines 165–167</w:t>
             </w:r>
           </w:p>
         </w:tc>
@@ -2388,7 +2338,7 @@
       <w:tr>
         <w:tc>
           <w:tcPr>
-            <w:tcW w:type="dxa" w:w="1152"/>
+            <w:tcW w:type="dxa" w:w="936"/>
             <w:tcMar>
               <w:top w:w="80" w:type="dxa"/>
               <w:bottom w:w="80" w:type="dxa"/>
@@ -2404,12 +2354,12 @@
           </w:tcPr>
           <w:p>
             <w:pPr>
-              <w:spacing w:after="40" w:line="240" w:lineRule="auto"/>
+              <w:jc w:val="left"/>
             </w:pPr>
             <w:r>
               <w:rPr>
-                <w:rFonts w:ascii="Times New Roman" w:hAnsi="Times New Roman"/>
-                <w:color w:val="000000"/>
+                <w:rFonts w:ascii="Cambria" w:hAnsi="Cambria"/>
+                <w:b/>
                 <w:sz w:val="18"/>
               </w:rPr>
             </w:r>
@@ -2417,7 +2367,7 @@
         </w:tc>
         <w:tc>
           <w:tcPr>
-            <w:tcW w:type="dxa" w:w="2592"/>
+            <w:tcW w:type="dxa" w:w="2088"/>
             <w:tcMar>
               <w:top w:w="80" w:type="dxa"/>
               <w:bottom w:w="80" w:type="dxa"/>
@@ -2433,12 +2383,11 @@
           </w:tcPr>
           <w:p>
             <w:pPr>
-              <w:spacing w:after="40" w:line="240" w:lineRule="auto"/>
+              <w:jc w:val="left"/>
             </w:pPr>
             <w:r>
               <w:rPr>
-                <w:rFonts w:ascii="Times New Roman" w:hAnsi="Times New Roman"/>
-                <w:color w:val="000000"/>
+                <w:rFonts w:ascii="Cambria" w:hAnsi="Cambria"/>
                 <w:sz w:val="18"/>
               </w:rPr>
             </w:r>
@@ -2446,7 +2395,7 @@
         </w:tc>
         <w:tc>
           <w:tcPr>
-            <w:tcW w:type="dxa" w:w="5184"/>
+            <w:tcW w:type="dxa" w:w="3384"/>
             <w:tcMar>
               <w:top w:w="80" w:type="dxa"/>
               <w:bottom w:w="80" w:type="dxa"/>
@@ -2462,12 +2411,11 @@
           </w:tcPr>
           <w:p>
             <w:pPr>
-              <w:spacing w:after="40" w:line="240" w:lineRule="auto"/>
+              <w:jc w:val="left"/>
             </w:pPr>
             <w:r>
               <w:rPr>
-                <w:rFonts w:ascii="Times New Roman" w:hAnsi="Times New Roman"/>
-                <w:color w:val="000000"/>
+                <w:rFonts w:ascii="Cambria" w:hAnsi="Cambria"/>
                 <w:sz w:val="18"/>
               </w:rPr>
               <w:t>(b) Give reasons for non-participation at each stage</w:t>
@@ -2476,7 +2424,7 @@
         </w:tc>
         <w:tc>
           <w:tcPr>
-            <w:tcW w:type="dxa" w:w="2592"/>
+            <w:tcW w:type="dxa" w:w="3384"/>
             <w:tcMar>
               <w:top w:w="80" w:type="dxa"/>
               <w:bottom w:w="80" w:type="dxa"/>
@@ -2492,15 +2440,15 @@
           </w:tcPr>
           <w:p>
             <w:pPr>
-              <w:spacing w:after="40" w:line="240" w:lineRule="auto"/>
+              <w:jc w:val="left"/>
             </w:pPr>
             <w:r>
               <w:rPr>
-                <w:rFonts w:ascii="Times New Roman" w:hAnsi="Times New Roman"/>
-                <w:color w:val="000000"/>
+                <w:rFonts w:ascii="Cambria" w:hAnsi="Cambria"/>
+                <w:b w:val="0"/>
                 <w:sz w:val="18"/>
               </w:rPr>
-              <w:t>Section 2.1, Page 5; Figure 2, Page 5</w:t>
+              <w:t>Section 'Study Design, Sampling, and Analytical Sample', Page 5, Lines 155–164; Figure 2, Page 6, Lines 165–167</w:t>
             </w:r>
           </w:p>
         </w:tc>
@@ -2508,7 +2456,7 @@
       <w:tr>
         <w:tc>
           <w:tcPr>
-            <w:tcW w:type="dxa" w:w="1152"/>
+            <w:tcW w:type="dxa" w:w="936"/>
             <w:tcMar>
               <w:top w:w="80" w:type="dxa"/>
               <w:bottom w:w="80" w:type="dxa"/>
@@ -2524,12 +2472,12 @@
           </w:tcPr>
           <w:p>
             <w:pPr>
-              <w:spacing w:after="40" w:line="240" w:lineRule="auto"/>
+              <w:jc w:val="left"/>
             </w:pPr>
             <w:r>
               <w:rPr>
-                <w:rFonts w:ascii="Times New Roman" w:hAnsi="Times New Roman"/>
-                <w:color w:val="000000"/>
+                <w:rFonts w:ascii="Cambria" w:hAnsi="Cambria"/>
+                <w:b/>
                 <w:sz w:val="18"/>
               </w:rPr>
             </w:r>
@@ -2537,7 +2485,7 @@
         </w:tc>
         <w:tc>
           <w:tcPr>
-            <w:tcW w:type="dxa" w:w="2592"/>
+            <w:tcW w:type="dxa" w:w="2088"/>
             <w:tcMar>
               <w:top w:w="80" w:type="dxa"/>
               <w:bottom w:w="80" w:type="dxa"/>
@@ -2553,12 +2501,11 @@
           </w:tcPr>
           <w:p>
             <w:pPr>
-              <w:spacing w:after="40" w:line="240" w:lineRule="auto"/>
+              <w:jc w:val="left"/>
             </w:pPr>
             <w:r>
               <w:rPr>
-                <w:rFonts w:ascii="Times New Roman" w:hAnsi="Times New Roman"/>
-                <w:color w:val="000000"/>
+                <w:rFonts w:ascii="Cambria" w:hAnsi="Cambria"/>
                 <w:sz w:val="18"/>
               </w:rPr>
             </w:r>
@@ -2566,7 +2513,7 @@
         </w:tc>
         <w:tc>
           <w:tcPr>
-            <w:tcW w:type="dxa" w:w="5184"/>
+            <w:tcW w:type="dxa" w:w="3384"/>
             <w:tcMar>
               <w:top w:w="80" w:type="dxa"/>
               <w:bottom w:w="80" w:type="dxa"/>
@@ -2582,12 +2529,11 @@
           </w:tcPr>
           <w:p>
             <w:pPr>
-              <w:spacing w:after="40" w:line="240" w:lineRule="auto"/>
+              <w:jc w:val="left"/>
             </w:pPr>
             <w:r>
               <w:rPr>
-                <w:rFonts w:ascii="Times New Roman" w:hAnsi="Times New Roman"/>
-                <w:color w:val="000000"/>
+                <w:rFonts w:ascii="Cambria" w:hAnsi="Cambria"/>
                 <w:sz w:val="18"/>
               </w:rPr>
               <w:t>(c) Consider use of a flow diagram</w:t>
@@ -2596,7 +2542,7 @@
         </w:tc>
         <w:tc>
           <w:tcPr>
-            <w:tcW w:type="dxa" w:w="2592"/>
+            <w:tcW w:type="dxa" w:w="3384"/>
             <w:tcMar>
               <w:top w:w="80" w:type="dxa"/>
               <w:bottom w:w="80" w:type="dxa"/>
@@ -2612,15 +2558,15 @@
           </w:tcPr>
           <w:p>
             <w:pPr>
-              <w:spacing w:after="40" w:line="240" w:lineRule="auto"/>
+              <w:jc w:val="left"/>
             </w:pPr>
             <w:r>
               <w:rPr>
-                <w:rFonts w:ascii="Times New Roman" w:hAnsi="Times New Roman"/>
-                <w:color w:val="000000"/>
+                <w:rFonts w:ascii="Cambria" w:hAnsi="Cambria"/>
+                <w:b w:val="0"/>
                 <w:sz w:val="18"/>
               </w:rPr>
-              <w:t>Figure 2, Page 5</w:t>
+              <w:t>Figure 2 (STROBE participant selection flow diagram), Page 6, Lines 165–167</w:t>
             </w:r>
           </w:p>
         </w:tc>
@@ -2628,7 +2574,7 @@
       <w:tr>
         <w:tc>
           <w:tcPr>
-            <w:tcW w:type="dxa" w:w="1152"/>
+            <w:tcW w:type="dxa" w:w="936"/>
             <w:tcMar>
               <w:top w:w="80" w:type="dxa"/>
               <w:bottom w:w="80" w:type="dxa"/>
@@ -2644,13 +2590,12 @@
           </w:tcPr>
           <w:p>
             <w:pPr>
-              <w:spacing w:after="40" w:line="240" w:lineRule="auto"/>
+              <w:jc w:val="left"/>
             </w:pPr>
             <w:r>
               <w:rPr>
-                <w:rFonts w:ascii="Times New Roman" w:hAnsi="Times New Roman"/>
+                <w:rFonts w:ascii="Cambria" w:hAnsi="Cambria"/>
                 <w:b/>
-                <w:color w:val="000000"/>
                 <w:sz w:val="18"/>
               </w:rPr>
               <w:t>14</w:t>
@@ -2659,7 +2604,7 @@
         </w:tc>
         <w:tc>
           <w:tcPr>
-            <w:tcW w:type="dxa" w:w="2592"/>
+            <w:tcW w:type="dxa" w:w="2088"/>
             <w:tcMar>
               <w:top w:w="80" w:type="dxa"/>
               <w:bottom w:w="80" w:type="dxa"/>
@@ -2675,13 +2620,11 @@
           </w:tcPr>
           <w:p>
             <w:pPr>
-              <w:spacing w:after="40" w:line="240" w:lineRule="auto"/>
+              <w:jc w:val="left"/>
             </w:pPr>
             <w:r>
               <w:rPr>
-                <w:rFonts w:ascii="Times New Roman" w:hAnsi="Times New Roman"/>
-                <w:b/>
-                <w:color w:val="000000"/>
+                <w:rFonts w:ascii="Cambria" w:hAnsi="Cambria"/>
                 <w:sz w:val="18"/>
               </w:rPr>
               <w:t>Descriptive data</w:t>
@@ -2690,7 +2633,7 @@
         </w:tc>
         <w:tc>
           <w:tcPr>
-            <w:tcW w:type="dxa" w:w="5184"/>
+            <w:tcW w:type="dxa" w:w="3384"/>
             <w:tcMar>
               <w:top w:w="80" w:type="dxa"/>
               <w:bottom w:w="80" w:type="dxa"/>
@@ -2706,21 +2649,20 @@
           </w:tcPr>
           <w:p>
             <w:pPr>
-              <w:spacing w:after="40" w:line="240" w:lineRule="auto"/>
+              <w:jc w:val="left"/>
             </w:pPr>
             <w:r>
               <w:rPr>
-                <w:rFonts w:ascii="Times New Roman" w:hAnsi="Times New Roman"/>
-                <w:color w:val="000000"/>
+                <w:rFonts w:ascii="Cambria" w:hAnsi="Cambria"/>
                 <w:sz w:val="18"/>
               </w:rPr>
-              <w:t>(a) Give characteristics of study participants and information on exposures and potential confounders</w:t>
+              <w:t>(a) Give characteristics of study participants (eg demographic, clinical, social) and information on exposures and potential confounders</w:t>
             </w:r>
           </w:p>
         </w:tc>
         <w:tc>
           <w:tcPr>
-            <w:tcW w:type="dxa" w:w="2592"/>
+            <w:tcW w:type="dxa" w:w="3384"/>
             <w:tcMar>
               <w:top w:w="80" w:type="dxa"/>
               <w:bottom w:w="80" w:type="dxa"/>
@@ -2736,15 +2678,15 @@
           </w:tcPr>
           <w:p>
             <w:pPr>
-              <w:spacing w:after="40" w:line="240" w:lineRule="auto"/>
+              <w:jc w:val="left"/>
             </w:pPr>
             <w:r>
               <w:rPr>
-                <w:rFonts w:ascii="Times New Roman" w:hAnsi="Times New Roman"/>
-                <w:color w:val="000000"/>
+                <w:rFonts w:ascii="Cambria" w:hAnsi="Cambria"/>
+                <w:b w:val="0"/>
                 <w:sz w:val="18"/>
               </w:rPr>
-              <w:t>Section 3.1, Page 6; Table 1, Page 7; Figure 3, Page 6</w:t>
+              <w:t>Section 'Prevalence of Child Undernutrition', Pages 8–9, Lines 253–280; Table 1, Pages 9–11, Line 281; Figure 3, Page 9, Lines 275–280</w:t>
             </w:r>
           </w:p>
         </w:tc>
@@ -2752,7 +2694,7 @@
       <w:tr>
         <w:tc>
           <w:tcPr>
-            <w:tcW w:type="dxa" w:w="1152"/>
+            <w:tcW w:type="dxa" w:w="936"/>
             <w:tcMar>
               <w:top w:w="80" w:type="dxa"/>
               <w:bottom w:w="80" w:type="dxa"/>
@@ -2768,12 +2710,12 @@
           </w:tcPr>
           <w:p>
             <w:pPr>
-              <w:spacing w:after="40" w:line="240" w:lineRule="auto"/>
+              <w:jc w:val="left"/>
             </w:pPr>
             <w:r>
               <w:rPr>
-                <w:rFonts w:ascii="Times New Roman" w:hAnsi="Times New Roman"/>
-                <w:color w:val="000000"/>
+                <w:rFonts w:ascii="Cambria" w:hAnsi="Cambria"/>
+                <w:b/>
                 <w:sz w:val="18"/>
               </w:rPr>
             </w:r>
@@ -2781,7 +2723,7 @@
         </w:tc>
         <w:tc>
           <w:tcPr>
-            <w:tcW w:type="dxa" w:w="2592"/>
+            <w:tcW w:type="dxa" w:w="2088"/>
             <w:tcMar>
               <w:top w:w="80" w:type="dxa"/>
               <w:bottom w:w="80" w:type="dxa"/>
@@ -2797,12 +2739,11 @@
           </w:tcPr>
           <w:p>
             <w:pPr>
-              <w:spacing w:after="40" w:line="240" w:lineRule="auto"/>
+              <w:jc w:val="left"/>
             </w:pPr>
             <w:r>
               <w:rPr>
-                <w:rFonts w:ascii="Times New Roman" w:hAnsi="Times New Roman"/>
-                <w:color w:val="000000"/>
+                <w:rFonts w:ascii="Cambria" w:hAnsi="Cambria"/>
                 <w:sz w:val="18"/>
               </w:rPr>
             </w:r>
@@ -2810,7 +2751,7 @@
         </w:tc>
         <w:tc>
           <w:tcPr>
-            <w:tcW w:type="dxa" w:w="5184"/>
+            <w:tcW w:type="dxa" w:w="3384"/>
             <w:tcMar>
               <w:top w:w="80" w:type="dxa"/>
               <w:bottom w:w="80" w:type="dxa"/>
@@ -2826,12 +2767,11 @@
           </w:tcPr>
           <w:p>
             <w:pPr>
-              <w:spacing w:after="40" w:line="240" w:lineRule="auto"/>
+              <w:jc w:val="left"/>
             </w:pPr>
             <w:r>
               <w:rPr>
-                <w:rFonts w:ascii="Times New Roman" w:hAnsi="Times New Roman"/>
-                <w:color w:val="000000"/>
+                <w:rFonts w:ascii="Cambria" w:hAnsi="Cambria"/>
                 <w:sz w:val="18"/>
               </w:rPr>
               <w:t>(b) Indicate number of participants with missing data for each variable of interest</w:t>
@@ -2840,7 +2780,7 @@
         </w:tc>
         <w:tc>
           <w:tcPr>
-            <w:tcW w:type="dxa" w:w="2592"/>
+            <w:tcW w:type="dxa" w:w="3384"/>
             <w:tcMar>
               <w:top w:w="80" w:type="dxa"/>
               <w:bottom w:w="80" w:type="dxa"/>
@@ -2856,15 +2796,15 @@
           </w:tcPr>
           <w:p>
             <w:pPr>
-              <w:spacing w:after="40" w:line="240" w:lineRule="auto"/>
+              <w:jc w:val="left"/>
             </w:pPr>
             <w:r>
               <w:rPr>
-                <w:rFonts w:ascii="Times New Roman" w:hAnsi="Times New Roman"/>
-                <w:color w:val="000000"/>
+                <w:rFonts w:ascii="Cambria" w:hAnsi="Cambria"/>
+                <w:b w:val="0"/>
                 <w:sz w:val="18"/>
               </w:rPr>
-              <w:t>Section 2.1, Page 5 (Complete-case sample N = 4,087)</w:t>
+              <w:t>Section 'Study Design, Sampling, and Analytical Sample', Page 5, Lines 155–164; Figure 2, Page 6, Lines 165–167 (Complete-case sample N = 4,087)</w:t>
             </w:r>
           </w:p>
         </w:tc>
@@ -2872,7 +2812,7 @@
       <w:tr>
         <w:tc>
           <w:tcPr>
-            <w:tcW w:type="dxa" w:w="1152"/>
+            <w:tcW w:type="dxa" w:w="936"/>
             <w:tcMar>
               <w:top w:w="80" w:type="dxa"/>
               <w:bottom w:w="80" w:type="dxa"/>
@@ -2888,13 +2828,12 @@
           </w:tcPr>
           <w:p>
             <w:pPr>
-              <w:spacing w:after="40" w:line="240" w:lineRule="auto"/>
+              <w:jc w:val="left"/>
             </w:pPr>
             <w:r>
               <w:rPr>
-                <w:rFonts w:ascii="Times New Roman" w:hAnsi="Times New Roman"/>
+                <w:rFonts w:ascii="Cambria" w:hAnsi="Cambria"/>
                 <w:b/>
-                <w:color w:val="000000"/>
                 <w:sz w:val="18"/>
               </w:rPr>
               <w:t>15</w:t>
@@ -2903,7 +2842,7 @@
         </w:tc>
         <w:tc>
           <w:tcPr>
-            <w:tcW w:type="dxa" w:w="2592"/>
+            <w:tcW w:type="dxa" w:w="2088"/>
             <w:tcMar>
               <w:top w:w="80" w:type="dxa"/>
               <w:bottom w:w="80" w:type="dxa"/>
@@ -2919,13 +2858,11 @@
           </w:tcPr>
           <w:p>
             <w:pPr>
-              <w:spacing w:after="40" w:line="240" w:lineRule="auto"/>
+              <w:jc w:val="left"/>
             </w:pPr>
             <w:r>
               <w:rPr>
-                <w:rFonts w:ascii="Times New Roman" w:hAnsi="Times New Roman"/>
-                <w:b/>
-                <w:color w:val="000000"/>
+                <w:rFonts w:ascii="Cambria" w:hAnsi="Cambria"/>
                 <w:sz w:val="18"/>
               </w:rPr>
               <w:t>Outcome data</w:t>
@@ -2934,7 +2871,7 @@
         </w:tc>
         <w:tc>
           <w:tcPr>
-            <w:tcW w:type="dxa" w:w="5184"/>
+            <w:tcW w:type="dxa" w:w="3384"/>
             <w:tcMar>
               <w:top w:w="80" w:type="dxa"/>
               <w:bottom w:w="80" w:type="dxa"/>
@@ -2950,12 +2887,11 @@
           </w:tcPr>
           <w:p>
             <w:pPr>
-              <w:spacing w:after="40" w:line="240" w:lineRule="auto"/>
+              <w:jc w:val="left"/>
             </w:pPr>
             <w:r>
               <w:rPr>
-                <w:rFonts w:ascii="Times New Roman" w:hAnsi="Times New Roman"/>
-                <w:color w:val="000000"/>
+                <w:rFonts w:ascii="Cambria" w:hAnsi="Cambria"/>
                 <w:sz w:val="18"/>
               </w:rPr>
               <w:t>Report numbers of outcome events or summary measures</w:t>
@@ -2964,7 +2900,7 @@
         </w:tc>
         <w:tc>
           <w:tcPr>
-            <w:tcW w:type="dxa" w:w="2592"/>
+            <w:tcW w:type="dxa" w:w="3384"/>
             <w:tcMar>
               <w:top w:w="80" w:type="dxa"/>
               <w:bottom w:w="80" w:type="dxa"/>
@@ -2980,15 +2916,15 @@
           </w:tcPr>
           <w:p>
             <w:pPr>
-              <w:spacing w:after="40" w:line="240" w:lineRule="auto"/>
+              <w:jc w:val="left"/>
             </w:pPr>
             <w:r>
               <w:rPr>
-                <w:rFonts w:ascii="Times New Roman" w:hAnsi="Times New Roman"/>
-                <w:color w:val="000000"/>
+                <w:rFonts w:ascii="Cambria" w:hAnsi="Cambria"/>
+                <w:b w:val="0"/>
                 <w:sz w:val="18"/>
               </w:rPr>
-              <w:t>Section 3.1, Page 6; Table 1, Page 7; Figure 3, Page 6</w:t>
+              <w:t>Section 'Prevalence of Child Undernutrition', Pages 8–9, Lines 253–280; Table 1, Pages 9–11, Line 281; Figure 3, Page 9, Lines 275–280</w:t>
             </w:r>
           </w:p>
         </w:tc>
@@ -2996,7 +2932,7 @@
       <w:tr>
         <w:tc>
           <w:tcPr>
-            <w:tcW w:type="dxa" w:w="1152"/>
+            <w:tcW w:type="dxa" w:w="936"/>
             <w:tcMar>
               <w:top w:w="80" w:type="dxa"/>
               <w:bottom w:w="80" w:type="dxa"/>
@@ -3012,13 +2948,12 @@
           </w:tcPr>
           <w:p>
             <w:pPr>
-              <w:spacing w:after="40" w:line="240" w:lineRule="auto"/>
+              <w:jc w:val="left"/>
             </w:pPr>
             <w:r>
               <w:rPr>
-                <w:rFonts w:ascii="Times New Roman" w:hAnsi="Times New Roman"/>
+                <w:rFonts w:ascii="Cambria" w:hAnsi="Cambria"/>
                 <w:b/>
-                <w:color w:val="000000"/>
                 <w:sz w:val="18"/>
               </w:rPr>
               <w:t>16</w:t>
@@ -3027,7 +2962,7 @@
         </w:tc>
         <w:tc>
           <w:tcPr>
-            <w:tcW w:type="dxa" w:w="2592"/>
+            <w:tcW w:type="dxa" w:w="2088"/>
             <w:tcMar>
               <w:top w:w="80" w:type="dxa"/>
               <w:bottom w:w="80" w:type="dxa"/>
@@ -3043,13 +2978,11 @@
           </w:tcPr>
           <w:p>
             <w:pPr>
-              <w:spacing w:after="40" w:line="240" w:lineRule="auto"/>
+              <w:jc w:val="left"/>
             </w:pPr>
             <w:r>
               <w:rPr>
-                <w:rFonts w:ascii="Times New Roman" w:hAnsi="Times New Roman"/>
-                <w:b/>
-                <w:color w:val="000000"/>
+                <w:rFonts w:ascii="Cambria" w:hAnsi="Cambria"/>
                 <w:sz w:val="18"/>
               </w:rPr>
               <w:t>Main results</w:t>
@@ -3058,7 +2991,7 @@
         </w:tc>
         <w:tc>
           <w:tcPr>
-            <w:tcW w:type="dxa" w:w="5184"/>
+            <w:tcW w:type="dxa" w:w="3384"/>
             <w:tcMar>
               <w:top w:w="80" w:type="dxa"/>
               <w:bottom w:w="80" w:type="dxa"/>
@@ -3074,12 +3007,11 @@
           </w:tcPr>
           <w:p>
             <w:pPr>
-              <w:spacing w:after="40" w:line="240" w:lineRule="auto"/>
+              <w:jc w:val="left"/>
             </w:pPr>
             <w:r>
               <w:rPr>
-                <w:rFonts w:ascii="Times New Roman" w:hAnsi="Times New Roman"/>
-                <w:color w:val="000000"/>
+                <w:rFonts w:ascii="Cambria" w:hAnsi="Cambria"/>
                 <w:sz w:val="18"/>
               </w:rPr>
               <w:t>(a) Give unadjusted estimates and, if applicable, confounder-adjusted estimates and their precision (eg, 95% confidence interval). Make clear which confounders were adjusted for and why they were included</w:t>
@@ -3088,7 +3020,7 @@
         </w:tc>
         <w:tc>
           <w:tcPr>
-            <w:tcW w:type="dxa" w:w="2592"/>
+            <w:tcW w:type="dxa" w:w="3384"/>
             <w:tcMar>
               <w:top w:w="80" w:type="dxa"/>
               <w:bottom w:w="80" w:type="dxa"/>
@@ -3104,15 +3036,15 @@
           </w:tcPr>
           <w:p>
             <w:pPr>
-              <w:spacing w:after="40" w:line="240" w:lineRule="auto"/>
+              <w:jc w:val="left"/>
             </w:pPr>
             <w:r>
               <w:rPr>
-                <w:rFonts w:ascii="Times New Roman" w:hAnsi="Times New Roman"/>
-                <w:color w:val="000000"/>
+                <w:rFonts w:ascii="Cambria" w:hAnsi="Cambria"/>
+                <w:b w:val="0"/>
                 <w:sz w:val="18"/>
               </w:rPr>
-              <w:t>Section 3.3–3.6, Pages 8–10; Table 2, Page 8; Table 3, Page 9; Tables S1–S3</w:t>
+              <w:t>Section 'Bivariate analysis' &amp; Table 2, Page 12, Lines 285–300; Sections 3.3–3.6, Pages 13–14, Lines 301–351; Table 3, Pages 14–17, Lines 352–354; Supplementary Tables S1–S3</w:t>
             </w:r>
           </w:p>
         </w:tc>
@@ -3120,7 +3052,7 @@
       <w:tr>
         <w:tc>
           <w:tcPr>
-            <w:tcW w:type="dxa" w:w="1152"/>
+            <w:tcW w:type="dxa" w:w="936"/>
             <w:tcMar>
               <w:top w:w="80" w:type="dxa"/>
               <w:bottom w:w="80" w:type="dxa"/>
@@ -3136,12 +3068,12 @@
           </w:tcPr>
           <w:p>
             <w:pPr>
-              <w:spacing w:after="40" w:line="240" w:lineRule="auto"/>
+              <w:jc w:val="left"/>
             </w:pPr>
             <w:r>
               <w:rPr>
-                <w:rFonts w:ascii="Times New Roman" w:hAnsi="Times New Roman"/>
-                <w:color w:val="000000"/>
+                <w:rFonts w:ascii="Cambria" w:hAnsi="Cambria"/>
+                <w:b/>
                 <w:sz w:val="18"/>
               </w:rPr>
             </w:r>
@@ -3149,7 +3081,7 @@
         </w:tc>
         <w:tc>
           <w:tcPr>
-            <w:tcW w:type="dxa" w:w="2592"/>
+            <w:tcW w:type="dxa" w:w="2088"/>
             <w:tcMar>
               <w:top w:w="80" w:type="dxa"/>
               <w:bottom w:w="80" w:type="dxa"/>
@@ -3165,12 +3097,11 @@
           </w:tcPr>
           <w:p>
             <w:pPr>
-              <w:spacing w:after="40" w:line="240" w:lineRule="auto"/>
+              <w:jc w:val="left"/>
             </w:pPr>
             <w:r>
               <w:rPr>
-                <w:rFonts w:ascii="Times New Roman" w:hAnsi="Times New Roman"/>
-                <w:color w:val="000000"/>
+                <w:rFonts w:ascii="Cambria" w:hAnsi="Cambria"/>
                 <w:sz w:val="18"/>
               </w:rPr>
             </w:r>
@@ -3178,7 +3109,7 @@
         </w:tc>
         <w:tc>
           <w:tcPr>
-            <w:tcW w:type="dxa" w:w="5184"/>
+            <w:tcW w:type="dxa" w:w="3384"/>
             <w:tcMar>
               <w:top w:w="80" w:type="dxa"/>
               <w:bottom w:w="80" w:type="dxa"/>
@@ -3194,12 +3125,11 @@
           </w:tcPr>
           <w:p>
             <w:pPr>
-              <w:spacing w:after="40" w:line="240" w:lineRule="auto"/>
+              <w:jc w:val="left"/>
             </w:pPr>
             <w:r>
               <w:rPr>
-                <w:rFonts w:ascii="Times New Roman" w:hAnsi="Times New Roman"/>
-                <w:color w:val="000000"/>
+                <w:rFonts w:ascii="Cambria" w:hAnsi="Cambria"/>
                 <w:sz w:val="18"/>
               </w:rPr>
               <w:t>(b) Report category boundaries when continuous variables were categorized</w:t>
@@ -3208,7 +3138,7 @@
         </w:tc>
         <w:tc>
           <w:tcPr>
-            <w:tcW w:type="dxa" w:w="2592"/>
+            <w:tcW w:type="dxa" w:w="3384"/>
             <w:tcMar>
               <w:top w:w="80" w:type="dxa"/>
               <w:bottom w:w="80" w:type="dxa"/>
@@ -3224,15 +3154,15 @@
           </w:tcPr>
           <w:p>
             <w:pPr>
-              <w:spacing w:after="40" w:line="240" w:lineRule="auto"/>
+              <w:jc w:val="left"/>
             </w:pPr>
             <w:r>
               <w:rPr>
-                <w:rFonts w:ascii="Times New Roman" w:hAnsi="Times New Roman"/>
-                <w:color w:val="000000"/>
+                <w:rFonts w:ascii="Cambria" w:hAnsi="Cambria"/>
+                <w:b w:val="0"/>
                 <w:sz w:val="18"/>
               </w:rPr>
-              <w:t>Section 2.3, Page 5; Table 1, Page 7</w:t>
+              <w:t>Section 'Explanatory Variables and conceptual Justification', Page 7, Lines 189–220; Table 1, Pages 9–11, Line 281</w:t>
             </w:r>
           </w:p>
         </w:tc>
@@ -3240,7 +3170,7 @@
       <w:tr>
         <w:tc>
           <w:tcPr>
-            <w:tcW w:type="dxa" w:w="1152"/>
+            <w:tcW w:type="dxa" w:w="936"/>
             <w:tcMar>
               <w:top w:w="80" w:type="dxa"/>
               <w:bottom w:w="80" w:type="dxa"/>
@@ -3256,12 +3186,12 @@
           </w:tcPr>
           <w:p>
             <w:pPr>
-              <w:spacing w:after="40" w:line="240" w:lineRule="auto"/>
+              <w:jc w:val="left"/>
             </w:pPr>
             <w:r>
               <w:rPr>
-                <w:rFonts w:ascii="Times New Roman" w:hAnsi="Times New Roman"/>
-                <w:color w:val="000000"/>
+                <w:rFonts w:ascii="Cambria" w:hAnsi="Cambria"/>
+                <w:b/>
                 <w:sz w:val="18"/>
               </w:rPr>
             </w:r>
@@ -3269,7 +3199,7 @@
         </w:tc>
         <w:tc>
           <w:tcPr>
-            <w:tcW w:type="dxa" w:w="2592"/>
+            <w:tcW w:type="dxa" w:w="2088"/>
             <w:tcMar>
               <w:top w:w="80" w:type="dxa"/>
               <w:bottom w:w="80" w:type="dxa"/>
@@ -3285,12 +3215,11 @@
           </w:tcPr>
           <w:p>
             <w:pPr>
-              <w:spacing w:after="40" w:line="240" w:lineRule="auto"/>
+              <w:jc w:val="left"/>
             </w:pPr>
             <w:r>
               <w:rPr>
-                <w:rFonts w:ascii="Times New Roman" w:hAnsi="Times New Roman"/>
-                <w:color w:val="000000"/>
+                <w:rFonts w:ascii="Cambria" w:hAnsi="Cambria"/>
                 <w:sz w:val="18"/>
               </w:rPr>
             </w:r>
@@ -3298,7 +3227,7 @@
         </w:tc>
         <w:tc>
           <w:tcPr>
-            <w:tcW w:type="dxa" w:w="5184"/>
+            <w:tcW w:type="dxa" w:w="3384"/>
             <w:tcMar>
               <w:top w:w="80" w:type="dxa"/>
               <w:bottom w:w="80" w:type="dxa"/>
@@ -3314,12 +3243,11 @@
           </w:tcPr>
           <w:p>
             <w:pPr>
-              <w:spacing w:after="40" w:line="240" w:lineRule="auto"/>
+              <w:jc w:val="left"/>
             </w:pPr>
             <w:r>
               <w:rPr>
-                <w:rFonts w:ascii="Times New Roman" w:hAnsi="Times New Roman"/>
-                <w:color w:val="000000"/>
+                <w:rFonts w:ascii="Cambria" w:hAnsi="Cambria"/>
                 <w:sz w:val="18"/>
               </w:rPr>
               <w:t>(c) If relevant, consider translating estimates of relative risk into absolute risk for a meaningful time period</w:t>
@@ -3328,7 +3256,7 @@
         </w:tc>
         <w:tc>
           <w:tcPr>
-            <w:tcW w:type="dxa" w:w="2592"/>
+            <w:tcW w:type="dxa" w:w="3384"/>
             <w:tcMar>
               <w:top w:w="80" w:type="dxa"/>
               <w:bottom w:w="80" w:type="dxa"/>
@@ -3344,15 +3272,16 @@
           </w:tcPr>
           <w:p>
             <w:pPr>
-              <w:spacing w:after="40" w:line="240" w:lineRule="auto"/>
+              <w:jc w:val="left"/>
             </w:pPr>
             <w:r>
               <w:rPr>
-                <w:rFonts w:ascii="Times New Roman" w:hAnsi="Times New Roman"/>
-                <w:color w:val="000000"/>
+                <w:rFonts w:ascii="Cambria" w:hAnsi="Cambria"/>
+                <w:i/>
+                <w:color w:val="7030A0"/>
                 <w:sz w:val="18"/>
               </w:rPr>
-              <w:t>Not Applicable (Cross-sectional odds ratios reported)</w:t>
+              <w:t>Not Applicable (Cross-sectional study reporting survey-weighted adjusted odds ratios [AORs] with 95% CIs and absolute prevalence proportions; cohort relative risk translation does not apply)</w:t>
             </w:r>
           </w:p>
         </w:tc>
@@ -3360,7 +3289,7 @@
       <w:tr>
         <w:tc>
           <w:tcPr>
-            <w:tcW w:type="dxa" w:w="1152"/>
+            <w:tcW w:type="dxa" w:w="936"/>
             <w:tcMar>
               <w:top w:w="80" w:type="dxa"/>
               <w:bottom w:w="80" w:type="dxa"/>
@@ -3376,13 +3305,12 @@
           </w:tcPr>
           <w:p>
             <w:pPr>
-              <w:spacing w:after="40" w:line="240" w:lineRule="auto"/>
+              <w:jc w:val="left"/>
             </w:pPr>
             <w:r>
               <w:rPr>
-                <w:rFonts w:ascii="Times New Roman" w:hAnsi="Times New Roman"/>
+                <w:rFonts w:ascii="Cambria" w:hAnsi="Cambria"/>
                 <w:b/>
-                <w:color w:val="000000"/>
                 <w:sz w:val="18"/>
               </w:rPr>
               <w:t>17</w:t>
@@ -3391,7 +3319,7 @@
         </w:tc>
         <w:tc>
           <w:tcPr>
-            <w:tcW w:type="dxa" w:w="2592"/>
+            <w:tcW w:type="dxa" w:w="2088"/>
             <w:tcMar>
               <w:top w:w="80" w:type="dxa"/>
               <w:bottom w:w="80" w:type="dxa"/>
@@ -3407,13 +3335,11 @@
           </w:tcPr>
           <w:p>
             <w:pPr>
-              <w:spacing w:after="40" w:line="240" w:lineRule="auto"/>
+              <w:jc w:val="left"/>
             </w:pPr>
             <w:r>
               <w:rPr>
-                <w:rFonts w:ascii="Times New Roman" w:hAnsi="Times New Roman"/>
-                <w:b/>
-                <w:color w:val="000000"/>
+                <w:rFonts w:ascii="Cambria" w:hAnsi="Cambria"/>
                 <w:sz w:val="18"/>
               </w:rPr>
               <w:t>Other analyses</w:t>
@@ -3422,7 +3348,7 @@
         </w:tc>
         <w:tc>
           <w:tcPr>
-            <w:tcW w:type="dxa" w:w="5184"/>
+            <w:tcW w:type="dxa" w:w="3384"/>
             <w:tcMar>
               <w:top w:w="80" w:type="dxa"/>
               <w:bottom w:w="80" w:type="dxa"/>
@@ -3438,12 +3364,11 @@
           </w:tcPr>
           <w:p>
             <w:pPr>
-              <w:spacing w:after="40" w:line="240" w:lineRule="auto"/>
+              <w:jc w:val="left"/>
             </w:pPr>
             <w:r>
               <w:rPr>
-                <w:rFonts w:ascii="Times New Roman" w:hAnsi="Times New Roman"/>
-                <w:color w:val="000000"/>
+                <w:rFonts w:ascii="Cambria" w:hAnsi="Cambria"/>
                 <w:sz w:val="18"/>
               </w:rPr>
               <w:t>Report other analyses done—eg analyses of subgroups and interactions, and sensitivity analyses</w:t>
@@ -3452,7 +3377,7 @@
         </w:tc>
         <w:tc>
           <w:tcPr>
-            <w:tcW w:type="dxa" w:w="2592"/>
+            <w:tcW w:type="dxa" w:w="3384"/>
             <w:tcMar>
               <w:top w:w="80" w:type="dxa"/>
               <w:bottom w:w="80" w:type="dxa"/>
@@ -3468,15 +3393,15 @@
           </w:tcPr>
           <w:p>
             <w:pPr>
-              <w:spacing w:after="40" w:line="240" w:lineRule="auto"/>
+              <w:jc w:val="left"/>
             </w:pPr>
             <w:r>
               <w:rPr>
-                <w:rFonts w:ascii="Times New Roman" w:hAnsi="Times New Roman"/>
-                <w:color w:val="000000"/>
+                <w:rFonts w:ascii="Cambria" w:hAnsi="Cambria"/>
+                <w:b w:val="0"/>
                 <w:sz w:val="18"/>
               </w:rPr>
-              <w:t>Section 3.3, Page 8; Tables S1–S4</w:t>
+              <w:t>Section 'Multilevel logistic regression analysis', Pages 13–14, Lines 301–314; Supplementary Tables S1–S3 (sequential Models 0, I, II, III for stunting, wasting, underweight); Table S4 (adjusted GVIF multicollinearity analysis)</w:t>
             </w:r>
           </w:p>
         </w:tc>
@@ -3484,7 +3409,7 @@
       <w:tr>
         <w:tc>
           <w:tcPr>
-            <w:tcW w:type="dxa" w:w="1152"/>
+            <w:tcW w:type="dxa" w:w="936"/>
             <w:tcMar>
               <w:top w:w="80" w:type="dxa"/>
               <w:bottom w:w="80" w:type="dxa"/>
@@ -3500,13 +3425,12 @@
           </w:tcPr>
           <w:p>
             <w:pPr>
-              <w:spacing w:after="40" w:line="240" w:lineRule="auto"/>
+              <w:jc w:val="left"/>
             </w:pPr>
             <w:r>
               <w:rPr>
-                <w:rFonts w:ascii="Times New Roman" w:hAnsi="Times New Roman"/>
+                <w:rFonts w:ascii="Cambria" w:hAnsi="Cambria"/>
                 <w:b/>
-                <w:color w:val="000000"/>
                 <w:sz w:val="18"/>
               </w:rPr>
               <w:t>18</w:t>
@@ -3515,7 +3439,7 @@
         </w:tc>
         <w:tc>
           <w:tcPr>
-            <w:tcW w:type="dxa" w:w="2592"/>
+            <w:tcW w:type="dxa" w:w="2088"/>
             <w:tcMar>
               <w:top w:w="80" w:type="dxa"/>
               <w:bottom w:w="80" w:type="dxa"/>
@@ -3531,13 +3455,11 @@
           </w:tcPr>
           <w:p>
             <w:pPr>
-              <w:spacing w:after="40" w:line="240" w:lineRule="auto"/>
+              <w:jc w:val="left"/>
             </w:pPr>
             <w:r>
               <w:rPr>
-                <w:rFonts w:ascii="Times New Roman" w:hAnsi="Times New Roman"/>
-                <w:b/>
-                <w:color w:val="000000"/>
+                <w:rFonts w:ascii="Cambria" w:hAnsi="Cambria"/>
                 <w:sz w:val="18"/>
               </w:rPr>
               <w:t>Key results</w:t>
@@ -3546,7 +3468,7 @@
         </w:tc>
         <w:tc>
           <w:tcPr>
-            <w:tcW w:type="dxa" w:w="5184"/>
+            <w:tcW w:type="dxa" w:w="3384"/>
             <w:tcMar>
               <w:top w:w="80" w:type="dxa"/>
               <w:bottom w:w="80" w:type="dxa"/>
@@ -3562,12 +3484,11 @@
           </w:tcPr>
           <w:p>
             <w:pPr>
-              <w:spacing w:after="40" w:line="240" w:lineRule="auto"/>
+              <w:jc w:val="left"/>
             </w:pPr>
             <w:r>
               <w:rPr>
-                <w:rFonts w:ascii="Times New Roman" w:hAnsi="Times New Roman"/>
-                <w:color w:val="000000"/>
+                <w:rFonts w:ascii="Cambria" w:hAnsi="Cambria"/>
                 <w:sz w:val="18"/>
               </w:rPr>
               <w:t>Summarise key results with reference to study objectives</w:t>
@@ -3576,7 +3497,7 @@
         </w:tc>
         <w:tc>
           <w:tcPr>
-            <w:tcW w:type="dxa" w:w="2592"/>
+            <w:tcW w:type="dxa" w:w="3384"/>
             <w:tcMar>
               <w:top w:w="80" w:type="dxa"/>
               <w:bottom w:w="80" w:type="dxa"/>
@@ -3592,15 +3513,15 @@
           </w:tcPr>
           <w:p>
             <w:pPr>
-              <w:spacing w:after="40" w:line="240" w:lineRule="auto"/>
+              <w:jc w:val="left"/>
             </w:pPr>
             <w:r>
               <w:rPr>
-                <w:rFonts w:ascii="Times New Roman" w:hAnsi="Times New Roman"/>
-                <w:color w:val="000000"/>
+                <w:rFonts w:ascii="Cambria" w:hAnsi="Cambria"/>
+                <w:b w:val="0"/>
                 <w:sz w:val="18"/>
               </w:rPr>
-              <w:t>Section 4 (Discussion), Pages 10–11</w:t>
+              <w:t>Section 'Discussion', Pages 17–19, Lines 355–442; Section 'Conclusion', Page 20, Lines 455–467</w:t>
             </w:r>
           </w:p>
         </w:tc>
@@ -3608,7 +3529,7 @@
       <w:tr>
         <w:tc>
           <w:tcPr>
-            <w:tcW w:type="dxa" w:w="1152"/>
+            <w:tcW w:type="dxa" w:w="936"/>
             <w:tcMar>
               <w:top w:w="80" w:type="dxa"/>
               <w:bottom w:w="80" w:type="dxa"/>
@@ -3624,13 +3545,12 @@
           </w:tcPr>
           <w:p>
             <w:pPr>
-              <w:spacing w:after="40" w:line="240" w:lineRule="auto"/>
+              <w:jc w:val="left"/>
             </w:pPr>
             <w:r>
               <w:rPr>
-                <w:rFonts w:ascii="Times New Roman" w:hAnsi="Times New Roman"/>
+                <w:rFonts w:ascii="Cambria" w:hAnsi="Cambria"/>
                 <w:b/>
-                <w:color w:val="000000"/>
                 <w:sz w:val="18"/>
               </w:rPr>
               <w:t>19</w:t>
@@ -3639,7 +3559,7 @@
         </w:tc>
         <w:tc>
           <w:tcPr>
-            <w:tcW w:type="dxa" w:w="2592"/>
+            <w:tcW w:type="dxa" w:w="2088"/>
             <w:tcMar>
               <w:top w:w="80" w:type="dxa"/>
               <w:bottom w:w="80" w:type="dxa"/>
@@ -3655,13 +3575,11 @@
           </w:tcPr>
           <w:p>
             <w:pPr>
-              <w:spacing w:after="40" w:line="240" w:lineRule="auto"/>
+              <w:jc w:val="left"/>
             </w:pPr>
             <w:r>
               <w:rPr>
-                <w:rFonts w:ascii="Times New Roman" w:hAnsi="Times New Roman"/>
-                <w:b/>
-                <w:color w:val="000000"/>
+                <w:rFonts w:ascii="Cambria" w:hAnsi="Cambria"/>
                 <w:sz w:val="18"/>
               </w:rPr>
               <w:t>Limitations</w:t>
@@ -3670,7 +3588,7 @@
         </w:tc>
         <w:tc>
           <w:tcPr>
-            <w:tcW w:type="dxa" w:w="5184"/>
+            <w:tcW w:type="dxa" w:w="3384"/>
             <w:tcMar>
               <w:top w:w="80" w:type="dxa"/>
               <w:bottom w:w="80" w:type="dxa"/>
@@ -3686,12 +3604,11 @@
           </w:tcPr>
           <w:p>
             <w:pPr>
-              <w:spacing w:after="40" w:line="240" w:lineRule="auto"/>
+              <w:jc w:val="left"/>
             </w:pPr>
             <w:r>
               <w:rPr>
-                <w:rFonts w:ascii="Times New Roman" w:hAnsi="Times New Roman"/>
-                <w:color w:val="000000"/>
+                <w:rFonts w:ascii="Cambria" w:hAnsi="Cambria"/>
                 <w:sz w:val="18"/>
               </w:rPr>
               <w:t>Discuss limitations of the study, taking into account sources of potential bias or imprecision. Discuss both direction and magnitude of any potential bias</w:t>
@@ -3700,7 +3617,7 @@
         </w:tc>
         <w:tc>
           <w:tcPr>
-            <w:tcW w:type="dxa" w:w="2592"/>
+            <w:tcW w:type="dxa" w:w="3384"/>
             <w:tcMar>
               <w:top w:w="80" w:type="dxa"/>
               <w:bottom w:w="80" w:type="dxa"/>
@@ -3716,15 +3633,15 @@
           </w:tcPr>
           <w:p>
             <w:pPr>
-              <w:spacing w:after="40" w:line="240" w:lineRule="auto"/>
+              <w:jc w:val="left"/>
             </w:pPr>
             <w:r>
               <w:rPr>
-                <w:rFonts w:ascii="Times New Roman" w:hAnsi="Times New Roman"/>
-                <w:color w:val="000000"/>
+                <w:rFonts w:ascii="Cambria" w:hAnsi="Cambria"/>
+                <w:b w:val="0"/>
                 <w:sz w:val="18"/>
               </w:rPr>
-              <w:t>Section 4 (Discussion), Page 12</w:t>
+              <w:t>Section 'Discussion' (Strengths and limitations), Pages 19–20, Lines 443–454</w:t>
             </w:r>
           </w:p>
         </w:tc>
@@ -3732,7 +3649,7 @@
       <w:tr>
         <w:tc>
           <w:tcPr>
-            <w:tcW w:type="dxa" w:w="1152"/>
+            <w:tcW w:type="dxa" w:w="936"/>
             <w:tcMar>
               <w:top w:w="80" w:type="dxa"/>
               <w:bottom w:w="80" w:type="dxa"/>
@@ -3748,13 +3665,12 @@
           </w:tcPr>
           <w:p>
             <w:pPr>
-              <w:spacing w:after="40" w:line="240" w:lineRule="auto"/>
+              <w:jc w:val="left"/>
             </w:pPr>
             <w:r>
               <w:rPr>
-                <w:rFonts w:ascii="Times New Roman" w:hAnsi="Times New Roman"/>
+                <w:rFonts w:ascii="Cambria" w:hAnsi="Cambria"/>
                 <w:b/>
-                <w:color w:val="000000"/>
                 <w:sz w:val="18"/>
               </w:rPr>
               <w:t>20</w:t>
@@ -3763,7 +3679,7 @@
         </w:tc>
         <w:tc>
           <w:tcPr>
-            <w:tcW w:type="dxa" w:w="2592"/>
+            <w:tcW w:type="dxa" w:w="2088"/>
             <w:tcMar>
               <w:top w:w="80" w:type="dxa"/>
               <w:bottom w:w="80" w:type="dxa"/>
@@ -3779,13 +3695,11 @@
           </w:tcPr>
           <w:p>
             <w:pPr>
-              <w:spacing w:after="40" w:line="240" w:lineRule="auto"/>
+              <w:jc w:val="left"/>
             </w:pPr>
             <w:r>
               <w:rPr>
-                <w:rFonts w:ascii="Times New Roman" w:hAnsi="Times New Roman"/>
-                <w:b/>
-                <w:color w:val="000000"/>
+                <w:rFonts w:ascii="Cambria" w:hAnsi="Cambria"/>
                 <w:sz w:val="18"/>
               </w:rPr>
               <w:t>Interpretation</w:t>
@@ -3794,7 +3708,7 @@
         </w:tc>
         <w:tc>
           <w:tcPr>
-            <w:tcW w:type="dxa" w:w="5184"/>
+            <w:tcW w:type="dxa" w:w="3384"/>
             <w:tcMar>
               <w:top w:w="80" w:type="dxa"/>
               <w:bottom w:w="80" w:type="dxa"/>
@@ -3810,12 +3724,11 @@
           </w:tcPr>
           <w:p>
             <w:pPr>
-              <w:spacing w:after="40" w:line="240" w:lineRule="auto"/>
+              <w:jc w:val="left"/>
             </w:pPr>
             <w:r>
               <w:rPr>
-                <w:rFonts w:ascii="Times New Roman" w:hAnsi="Times New Roman"/>
-                <w:color w:val="000000"/>
+                <w:rFonts w:ascii="Cambria" w:hAnsi="Cambria"/>
                 <w:sz w:val="18"/>
               </w:rPr>
               <w:t>Give a cautious overall interpretation of results considering objectives, limitations, multiplicity of analyses, results from similar studies, and other relevant evidence</w:t>
@@ -3824,7 +3737,7 @@
         </w:tc>
         <w:tc>
           <w:tcPr>
-            <w:tcW w:type="dxa" w:w="2592"/>
+            <w:tcW w:type="dxa" w:w="3384"/>
             <w:tcMar>
               <w:top w:w="80" w:type="dxa"/>
               <w:bottom w:w="80" w:type="dxa"/>
@@ -3840,15 +3753,15 @@
           </w:tcPr>
           <w:p>
             <w:pPr>
-              <w:spacing w:after="40" w:line="240" w:lineRule="auto"/>
+              <w:jc w:val="left"/>
             </w:pPr>
             <w:r>
               <w:rPr>
-                <w:rFonts w:ascii="Times New Roman" w:hAnsi="Times New Roman"/>
-                <w:color w:val="000000"/>
+                <w:rFonts w:ascii="Cambria" w:hAnsi="Cambria"/>
+                <w:b w:val="0"/>
                 <w:sz w:val="18"/>
               </w:rPr>
-              <w:t>Section 4 (Discussion), Pages 10–12</w:t>
+              <w:t>Section 'Discussion', Pages 17–20, Lines 355–454</w:t>
             </w:r>
           </w:p>
         </w:tc>
@@ -3856,7 +3769,7 @@
       <w:tr>
         <w:tc>
           <w:tcPr>
-            <w:tcW w:type="dxa" w:w="1152"/>
+            <w:tcW w:type="dxa" w:w="936"/>
             <w:tcMar>
               <w:top w:w="80" w:type="dxa"/>
               <w:bottom w:w="80" w:type="dxa"/>
@@ -3872,13 +3785,12 @@
           </w:tcPr>
           <w:p>
             <w:pPr>
-              <w:spacing w:after="40" w:line="240" w:lineRule="auto"/>
+              <w:jc w:val="left"/>
             </w:pPr>
             <w:r>
               <w:rPr>
-                <w:rFonts w:ascii="Times New Roman" w:hAnsi="Times New Roman"/>
+                <w:rFonts w:ascii="Cambria" w:hAnsi="Cambria"/>
                 <w:b/>
-                <w:color w:val="000000"/>
                 <w:sz w:val="18"/>
               </w:rPr>
               <w:t>21</w:t>
@@ -3887,7 +3799,7 @@
         </w:tc>
         <w:tc>
           <w:tcPr>
-            <w:tcW w:type="dxa" w:w="2592"/>
+            <w:tcW w:type="dxa" w:w="2088"/>
             <w:tcMar>
               <w:top w:w="80" w:type="dxa"/>
               <w:bottom w:w="80" w:type="dxa"/>
@@ -3903,13 +3815,11 @@
           </w:tcPr>
           <w:p>
             <w:pPr>
-              <w:spacing w:after="40" w:line="240" w:lineRule="auto"/>
+              <w:jc w:val="left"/>
             </w:pPr>
             <w:r>
               <w:rPr>
-                <w:rFonts w:ascii="Times New Roman" w:hAnsi="Times New Roman"/>
-                <w:b/>
-                <w:color w:val="000000"/>
+                <w:rFonts w:ascii="Cambria" w:hAnsi="Cambria"/>
                 <w:sz w:val="18"/>
               </w:rPr>
               <w:t>Generalisability</w:t>
@@ -3918,7 +3828,7 @@
         </w:tc>
         <w:tc>
           <w:tcPr>
-            <w:tcW w:type="dxa" w:w="5184"/>
+            <w:tcW w:type="dxa" w:w="3384"/>
             <w:tcMar>
               <w:top w:w="80" w:type="dxa"/>
               <w:bottom w:w="80" w:type="dxa"/>
@@ -3934,12 +3844,11 @@
           </w:tcPr>
           <w:p>
             <w:pPr>
-              <w:spacing w:after="40" w:line="240" w:lineRule="auto"/>
+              <w:jc w:val="left"/>
             </w:pPr>
             <w:r>
               <w:rPr>
-                <w:rFonts w:ascii="Times New Roman" w:hAnsi="Times New Roman"/>
-                <w:color w:val="000000"/>
+                <w:rFonts w:ascii="Cambria" w:hAnsi="Cambria"/>
                 <w:sz w:val="18"/>
               </w:rPr>
               <w:t>Discuss the generalisability (external validity) of the study results</w:t>
@@ -3948,7 +3857,7 @@
         </w:tc>
         <w:tc>
           <w:tcPr>
-            <w:tcW w:type="dxa" w:w="2592"/>
+            <w:tcW w:type="dxa" w:w="3384"/>
             <w:tcMar>
               <w:top w:w="80" w:type="dxa"/>
               <w:bottom w:w="80" w:type="dxa"/>
@@ -3964,15 +3873,15 @@
           </w:tcPr>
           <w:p>
             <w:pPr>
-              <w:spacing w:after="40" w:line="240" w:lineRule="auto"/>
+              <w:jc w:val="left"/>
             </w:pPr>
             <w:r>
               <w:rPr>
-                <w:rFonts w:ascii="Times New Roman" w:hAnsi="Times New Roman"/>
-                <w:color w:val="000000"/>
+                <w:rFonts w:ascii="Cambria" w:hAnsi="Cambria"/>
+                <w:b w:val="0"/>
                 <w:sz w:val="18"/>
               </w:rPr>
-              <w:t>Section 4 (Discussion), Page 12</w:t>
+              <w:t>Section 'Discussion' (Strengths and limitations), Pages 19–20, Lines 443–454</w:t>
             </w:r>
           </w:p>
         </w:tc>
@@ -3980,7 +3889,7 @@
       <w:tr>
         <w:tc>
           <w:tcPr>
-            <w:tcW w:type="dxa" w:w="1152"/>
+            <w:tcW w:type="dxa" w:w="936"/>
             <w:tcMar>
               <w:top w:w="80" w:type="dxa"/>
               <w:bottom w:w="80" w:type="dxa"/>
@@ -3996,13 +3905,12 @@
           </w:tcPr>
           <w:p>
             <w:pPr>
-              <w:spacing w:after="40" w:line="240" w:lineRule="auto"/>
+              <w:jc w:val="left"/>
             </w:pPr>
             <w:r>
               <w:rPr>
-                <w:rFonts w:ascii="Times New Roman" w:hAnsi="Times New Roman"/>
+                <w:rFonts w:ascii="Cambria" w:hAnsi="Cambria"/>
                 <w:b/>
-                <w:color w:val="000000"/>
                 <w:sz w:val="18"/>
               </w:rPr>
               <w:t>22</w:t>
@@ -4011,7 +3919,7 @@
         </w:tc>
         <w:tc>
           <w:tcPr>
-            <w:tcW w:type="dxa" w:w="2592"/>
+            <w:tcW w:type="dxa" w:w="2088"/>
             <w:tcMar>
               <w:top w:w="80" w:type="dxa"/>
               <w:bottom w:w="80" w:type="dxa"/>
@@ -4027,13 +3935,11 @@
           </w:tcPr>
           <w:p>
             <w:pPr>
-              <w:spacing w:after="40" w:line="240" w:lineRule="auto"/>
+              <w:jc w:val="left"/>
             </w:pPr>
             <w:r>
               <w:rPr>
-                <w:rFonts w:ascii="Times New Roman" w:hAnsi="Times New Roman"/>
-                <w:b/>
-                <w:color w:val="000000"/>
+                <w:rFonts w:ascii="Cambria" w:hAnsi="Cambria"/>
                 <w:sz w:val="18"/>
               </w:rPr>
               <w:t>Funding</w:t>
@@ -4042,7 +3948,7 @@
         </w:tc>
         <w:tc>
           <w:tcPr>
-            <w:tcW w:type="dxa" w:w="5184"/>
+            <w:tcW w:type="dxa" w:w="3384"/>
             <w:tcMar>
               <w:top w:w="80" w:type="dxa"/>
               <w:bottom w:w="80" w:type="dxa"/>
@@ -4058,21 +3964,20 @@
           </w:tcPr>
           <w:p>
             <w:pPr>
-              <w:spacing w:after="40" w:line="240" w:lineRule="auto"/>
+              <w:jc w:val="left"/>
             </w:pPr>
             <w:r>
               <w:rPr>
-                <w:rFonts w:ascii="Times New Roman" w:hAnsi="Times New Roman"/>
-                <w:color w:val="000000"/>
+                <w:rFonts w:ascii="Cambria" w:hAnsi="Cambria"/>
                 <w:sz w:val="18"/>
               </w:rPr>
-              <w:t>Give the source of funding and the role of the funders for the present study</w:t>
+              <w:t>Give the source of funding and the role of the funders for the present study and, if applicable, for the original study on which the present article is based</w:t>
             </w:r>
           </w:p>
         </w:tc>
         <w:tc>
           <w:tcPr>
-            <w:tcW w:type="dxa" w:w="2592"/>
+            <w:tcW w:type="dxa" w:w="3384"/>
             <w:tcMar>
               <w:top w:w="80" w:type="dxa"/>
               <w:bottom w:w="80" w:type="dxa"/>
@@ -4088,15 +3993,15 @@
           </w:tcPr>
           <w:p>
             <w:pPr>
-              <w:spacing w:after="40" w:line="240" w:lineRule="auto"/>
+              <w:jc w:val="left"/>
             </w:pPr>
             <w:r>
               <w:rPr>
-                <w:rFonts w:ascii="Times New Roman" w:hAnsi="Times New Roman"/>
-                <w:color w:val="000000"/>
+                <w:rFonts w:ascii="Cambria" w:hAnsi="Cambria"/>
+                <w:b w:val="0"/>
                 <w:sz w:val="18"/>
               </w:rPr>
-              <w:t>Declarations (Funding), Page 13</w:t>
+              <w:t>Section 'Declarations' (Funding statement), Page 21, Lines 488–489</w:t>
             </w:r>
           </w:p>
         </w:tc>

</xml_diff>